<commit_message>
Completa las seis vistas con la exportacion de draw.io
Faltaba la vista de asignacion de patrones, que seguia con la version de
Graphviz y desentonaba con las otras cinco. Ahora los seis modelos de
arquitectura del documento provienen del mismo origen y comparten estilo,
paleta y tipografia.

Las nueve figuras del entregable quedan asi: seis vistas de arquitectura
exportadas desde draw.io y editables, y tres diagramas de estructura de
los patrones criticos que siguen generandose con Graphviz.
</commit_message>
<xml_diff>
--- a/documentos/semana-4/entregable_semana4.docx
+++ b/documentos/semana-4/entregable_semana4.docx
@@ -3783,7 +3783,7 @@
       <w:r>
         <w:drawing>
           <wp:inline xmlns:wp="http://schemas.openxmlformats.org/drawingml/2006/wordprocessingDrawing" distT="0" distB="0" distL="0" distR="0">
-            <wp:extent cx="6126480" cy="3368064"/>
+            <wp:extent cx="6126480" cy="4508955"/>
             <wp:docPr id="105" name="Imagen 105"/>
             <a:graphic xmlns:a="http://schemas.openxmlformats.org/drawingml/2006/main">
               <a:graphicData uri="http://schemas.openxmlformats.org/drawingml/2006/picture">
@@ -3801,7 +3801,7 @@
                   <pic:spPr>
                     <a:xfrm>
                       <a:off x="0" y="0"/>
-                      <a:ext cx="6126480" cy="3368064"/>
+                      <a:ext cx="6126480" cy="4508955"/>
                     </a:xfrm>
                     <a:prstGeom prst="rect">
                       <a:avLst/>

</xml_diff>

<commit_message>
Incorpora la vista UML y reescribe el guion del video
- Se agrega la vista funcional en notacion componente-conector UML como
  Figura 3, con la tabla que explica que significa cada simbolo y por que
  la notacion importa: los ocho contratos del sistema quedan nombrados
  (APICliente, Cotizar, Scoring, Tokenizar, CobrarPrima, EmitirPoliza,
  PerfilExterno, PasarelaPago, VerificarIdentidad) y son la parte
  verificable del compromiso con el Proyecto Final 2.
- El documento pasa a diez figuras, renumeradas de forma consecutiva.
- Se reescribe el guion del video para cubrir todo el avance de la
  semana: pasa de seis a siete bloques y de ocho a diez minutos,
  incorporando el estilo de arquitectura, el modelo componente-conector,
  la matriz de trazabilidad, el criterio de cuantos experimentos y el
  reencuadre de la capacidad contra los tres sprints del Proyecto Final 2.
</commit_message>
<xml_diff>
--- a/documentos/semana-4/entregable_semana4.docx
+++ b/documentos/semana-4/entregable_semana4.docx
@@ -580,7 +580,7 @@
               <w:spacing w:before="20" w:after="20"/>
             </w:pPr>
             <w:r>
-              <w:t xml:space="preserve">§2.1 declara el estilo de arquitectura y lo justifica; §2.2 a §2.5 desarrollan cinco modelos: contexto, funcional, despliegue, información y dominio</w:t>
+              <w:t xml:space="preserve">§2.1 declara el estilo de arquitectura y lo justifica; §2.2 a §2.5 desarrollan seis modelos: contexto, funcional, componente-conector en notación UML, despliegue, información y dominio</w:t>
             </w:r>
           </w:p>
         </w:tc>
@@ -2057,7 +2057,7 @@
           <w:sz w:val="18"/>
           <w:color w:val="666666"/>
         </w:rPr>
-        <w:t xml:space="preserve">Figura 1. Diagrama de contexto: actores, sistemas externos y qué intercambia Solventa con cada uno</w:t>
+        <w:t xml:space="preserve">Figura 1. Figura 1. Diagrama de contexto: actores, sistemas externos y qué intercambia Solventa con cada uno</w:t>
       </w:r>
     </w:p>
     <w:p>
@@ -2156,7 +2156,7 @@
           <w:sz w:val="18"/>
           <w:color w:val="666666"/>
         </w:rPr>
-        <w:t xml:space="preserve">Figura 2. Vista funcional: capas Edge, BFF, núcleo de negocio y adaptadores externos</w:t>
+        <w:t xml:space="preserve">Figura 2. Figura 2. Vista funcional: capas Edge, BFF, núcleo de negocio y adaptadores externos</w:t>
       </w:r>
     </w:p>
     <w:p>
@@ -2227,15 +2227,24 @@
     </w:p>
     <w:p>
       <w:pPr>
-        <w:pStyle w:val="Heading3"/>
+        <w:pStyle w:val="Heading4"/>
       </w:pPr>
       <w:r>
-        <w:t xml:space="preserve">2.4 Vista de despliegue</w:t>
-      </w:r>
-    </w:p>
-    <w:p>
-      <w:r>
-        <w:t xml:space="preserve">La vista de despliegue muestra dónde se ejecuta cada componente y qué mecanismos de redundancia lo protegen.</w:t>
+        <w:t xml:space="preserve">El mismo nivel funcional como modelo componente-conector</w:t>
+      </w:r>
+    </w:p>
+    <w:p>
+      <w:r>
+        <w:t xml:space="preserve">La vista anterior sirve para orientarse, pero sus flechas no dicen si una interacción es síncrona o asíncrona ni cuál es el contrato que se usa. El modelo siguiente expresa la misma estructura en </w:t>
+      </w:r>
+      <w:r>
+        <w:rPr>
+          <w:b/>
+        </w:rPr>
+        <w:t xml:space="preserve">notación UML de componente-conector</w:t>
+      </w:r>
+      <w:r>
+        <w:t xml:space="preserve">, donde cada símbolo tiene significado definido.</w:t>
       </w:r>
     </w:p>
     <w:p>
@@ -2246,17 +2255,576 @@
       <w:r>
         <w:drawing>
           <wp:inline xmlns:wp="http://schemas.openxmlformats.org/drawingml/2006/wordprocessingDrawing" distT="0" distB="0" distL="0" distR="0">
-            <wp:extent cx="6126480" cy="4015437"/>
+            <wp:extent cx="6126480" cy="4868499"/>
             <wp:docPr id="102" name="Imagen 102"/>
             <a:graphic xmlns:a="http://schemas.openxmlformats.org/drawingml/2006/main">
               <a:graphicData uri="http://schemas.openxmlformats.org/drawingml/2006/picture">
                 <pic:pic xmlns:pic="http://schemas.openxmlformats.org/drawingml/2006/picture">
                   <pic:nvPicPr>
-                    <pic:cNvPr id="102" name="vista_despliegue.png"/>
+                    <pic:cNvPr id="102" name="vista_funcional_uml.png"/>
                     <pic:cNvPicPr/>
                   </pic:nvPicPr>
                   <pic:blipFill>
                     <a:blip xmlns:r="http://schemas.openxmlformats.org/officeDocument/2006/relationships" r:embed="rIdImg2"/>
+                    <a:stretch>
+                      <a:fillRect/>
+                    </a:stretch>
+                  </pic:blipFill>
+                  <pic:spPr>
+                    <a:xfrm>
+                      <a:off x="0" y="0"/>
+                      <a:ext cx="6126480" cy="4868499"/>
+                    </a:xfrm>
+                    <a:prstGeom prst="rect">
+                      <a:avLst/>
+                    </a:prstGeom>
+                  </pic:spPr>
+                </pic:pic>
+              </a:graphicData>
+            </a:graphic>
+          </wp:inline>
+        </w:drawing>
+      </w:r>
+    </w:p>
+    <w:p>
+      <w:pPr>
+        <w:jc w:val="center"/>
+        <w:spacing w:after="200"/>
+      </w:pPr>
+      <w:r>
+        <w:rPr>
+          <w:i/>
+          <w:sz w:val="18"/>
+          <w:color w:val="666666"/>
+        </w:rPr>
+        <w:t xml:space="preserve">Figura 3. Figura 3. Vista funcional como modelo componente-conector en notación UML, con puertos e interfaces provistas y requeridas</w:t>
+      </w:r>
+    </w:p>
+    <w:tbl>
+      <w:tblPr>
+        <w:tblW w:w="5000" w:type="pct"/>
+        <w:tblBorders>
+          <w:top w:val="single" w:sz="4" w:space="0" w:color="BFBFBF"/>
+          <w:left w:val="single" w:sz="4" w:space="0" w:color="BFBFBF"/>
+          <w:bottom w:val="single" w:sz="4" w:space="0" w:color="BFBFBF"/>
+          <w:right w:val="single" w:sz="4" w:space="0" w:color="BFBFBF"/>
+          <w:insideH w:val="single" w:sz="4" w:space="0" w:color="BFBFBF"/>
+          <w:insideV w:val="single" w:sz="4" w:space="0" w:color="BFBFBF"/>
+        </w:tblBorders>
+        <w:tblLayout w:type="fixed"/>
+      </w:tblPr>
+      <w:tr>
+        <w:trPr>
+          <w:tblHeader/>
+        </w:trPr>
+        <w:tc>
+          <w:tcPr>
+            <w:tcW w:w="0" w:type="auto"/>
+            <w:shd w:val="clear" w:fill="EDF2F7"/>
+          </w:tcPr>
+          <w:p>
+            <w:pPr>
+              <w:spacing w:before="20" w:after="20"/>
+            </w:pPr>
+            <w:r>
+              <w:rPr>
+                <w:b/>
+              </w:rPr>
+              <w:t xml:space="preserve">Símbolo</w:t>
+            </w:r>
+          </w:p>
+        </w:tc>
+        <w:tc>
+          <w:tcPr>
+            <w:tcW w:w="0" w:type="auto"/>
+            <w:shd w:val="clear" w:fill="EDF2F7"/>
+          </w:tcPr>
+          <w:p>
+            <w:pPr>
+              <w:spacing w:before="20" w:after="20"/>
+            </w:pPr>
+            <w:r>
+              <w:rPr>
+                <w:b/>
+              </w:rPr>
+              <w:t xml:space="preserve">Qué es</w:t>
+            </w:r>
+          </w:p>
+        </w:tc>
+        <w:tc>
+          <w:tcPr>
+            <w:tcW w:w="0" w:type="auto"/>
+            <w:shd w:val="clear" w:fill="EDF2F7"/>
+          </w:tcPr>
+          <w:p>
+            <w:pPr>
+              <w:spacing w:before="20" w:after="20"/>
+            </w:pPr>
+            <w:r>
+              <w:rPr>
+                <w:b/>
+              </w:rPr>
+              <w:t xml:space="preserve">Qué comunica</w:t>
+            </w:r>
+          </w:p>
+        </w:tc>
+      </w:tr>
+      <w:tr>
+        <w:tc>
+          <w:tcPr>
+            <w:tcW w:w="0" w:type="auto"/>
+          </w:tcPr>
+          <w:p>
+            <w:pPr>
+              <w:spacing w:before="20" w:after="20"/>
+            </w:pPr>
+            <w:r>
+              <w:t xml:space="preserve">Cuadrado sobre el borde</w:t>
+            </w:r>
+          </w:p>
+        </w:tc>
+        <w:tc>
+          <w:tcPr>
+            <w:tcW w:w="0" w:type="auto"/>
+          </w:tcPr>
+          <w:p>
+            <w:pPr>
+              <w:spacing w:before="20" w:after="20"/>
+            </w:pPr>
+            <w:r>
+              <w:rPr>
+                <w:b/>
+              </w:rPr>
+              <w:t xml:space="preserve">Puerto</w:t>
+            </w:r>
+          </w:p>
+        </w:tc>
+        <w:tc>
+          <w:tcPr>
+            <w:tcW w:w="0" w:type="auto"/>
+          </w:tcPr>
+          <w:p>
+            <w:pPr>
+              <w:spacing w:before="20" w:after="20"/>
+            </w:pPr>
+            <w:r>
+              <w:t xml:space="preserve">Punto de interacción con nombre propio; aísla el interior del componente de su exterior</w:t>
+            </w:r>
+          </w:p>
+        </w:tc>
+      </w:tr>
+      <w:tr>
+        <w:tc>
+          <w:tcPr>
+            <w:tcW w:w="0" w:type="auto"/>
+          </w:tcPr>
+          <w:p>
+            <w:pPr>
+              <w:spacing w:before="20" w:after="20"/>
+            </w:pPr>
+            <w:r>
+              <w:t xml:space="preserve">Círculo</w:t>
+            </w:r>
+          </w:p>
+        </w:tc>
+        <w:tc>
+          <w:tcPr>
+            <w:tcW w:w="0" w:type="auto"/>
+          </w:tcPr>
+          <w:p>
+            <w:pPr>
+              <w:spacing w:before="20" w:after="20"/>
+            </w:pPr>
+            <w:r>
+              <w:rPr>
+                <w:b/>
+              </w:rPr>
+              <w:t xml:space="preserve">Interfaz provista</w:t>
+            </w:r>
+          </w:p>
+        </w:tc>
+        <w:tc>
+          <w:tcPr>
+            <w:tcW w:w="0" w:type="auto"/>
+          </w:tcPr>
+          <w:p>
+            <w:pPr>
+              <w:spacing w:before="20" w:after="20"/>
+            </w:pPr>
+            <w:r>
+              <w:t xml:space="preserve">Lo que el componente ofrece</w:t>
+            </w:r>
+          </w:p>
+        </w:tc>
+      </w:tr>
+      <w:tr>
+        <w:tc>
+          <w:tcPr>
+            <w:tcW w:w="0" w:type="auto"/>
+          </w:tcPr>
+          <w:p>
+            <w:pPr>
+              <w:spacing w:before="20" w:after="20"/>
+            </w:pPr>
+            <w:r>
+              <w:t xml:space="preserve">Semicírculo</w:t>
+            </w:r>
+          </w:p>
+        </w:tc>
+        <w:tc>
+          <w:tcPr>
+            <w:tcW w:w="0" w:type="auto"/>
+          </w:tcPr>
+          <w:p>
+            <w:pPr>
+              <w:spacing w:before="20" w:after="20"/>
+            </w:pPr>
+            <w:r>
+              <w:rPr>
+                <w:b/>
+              </w:rPr>
+              <w:t xml:space="preserve">Interfaz requerida</w:t>
+            </w:r>
+          </w:p>
+        </w:tc>
+        <w:tc>
+          <w:tcPr>
+            <w:tcW w:w="0" w:type="auto"/>
+          </w:tcPr>
+          <w:p>
+            <w:pPr>
+              <w:spacing w:before="20" w:after="20"/>
+            </w:pPr>
+            <w:r>
+              <w:t xml:space="preserve">Lo que el componente necesita</w:t>
+            </w:r>
+          </w:p>
+        </w:tc>
+      </w:tr>
+      <w:tr>
+        <w:tc>
+          <w:tcPr>
+            <w:tcW w:w="0" w:type="auto"/>
+          </w:tcPr>
+          <w:p>
+            <w:pPr>
+              <w:spacing w:before="20" w:after="20"/>
+            </w:pPr>
+            <w:r>
+              <w:t xml:space="preserve">Círculo encajado en semicírculo</w:t>
+            </w:r>
+          </w:p>
+        </w:tc>
+        <w:tc>
+          <w:tcPr>
+            <w:tcW w:w="0" w:type="auto"/>
+          </w:tcPr>
+          <w:p>
+            <w:pPr>
+              <w:spacing w:before="20" w:after="20"/>
+            </w:pPr>
+            <w:r>
+              <w:rPr>
+                <w:b/>
+              </w:rPr>
+              <w:t xml:space="preserve">Conector de ensamblaje</w:t>
+            </w:r>
+          </w:p>
+        </w:tc>
+        <w:tc>
+          <w:tcPr>
+            <w:tcW w:w="0" w:type="auto"/>
+          </w:tcPr>
+          <w:p>
+            <w:pPr>
+              <w:spacing w:before="20" w:after="20"/>
+            </w:pPr>
+            <w:r>
+              <w:t xml:space="preserve">El contrato concreto entre dos componentes</w:t>
+            </w:r>
+          </w:p>
+        </w:tc>
+      </w:tr>
+      <w:tr>
+        <w:tc>
+          <w:tcPr>
+            <w:tcW w:w="0" w:type="auto"/>
+          </w:tcPr>
+          <w:p>
+            <w:pPr>
+              <w:spacing w:before="20" w:after="20"/>
+            </w:pPr>
+            <w:r>
+              <w:t xml:space="preserve">Conector marcado con </w:t>
+            </w:r>
+            <w:r>
+              <w:rPr>
+                <w:b/>
+              </w:rPr>
+              <w:t xml:space="preserve">M</w:t>
+            </w:r>
+          </w:p>
+        </w:tc>
+        <w:tc>
+          <w:tcPr>
+            <w:tcW w:w="0" w:type="auto"/>
+          </w:tcPr>
+          <w:p>
+            <w:pPr>
+              <w:spacing w:before="20" w:after="20"/>
+            </w:pPr>
+            <w:r>
+              <w:t xml:space="preserve">Conector de mensajería</w:t>
+            </w:r>
+          </w:p>
+        </w:tc>
+        <w:tc>
+          <w:tcPr>
+            <w:tcW w:w="0" w:type="auto"/>
+          </w:tcPr>
+          <w:p>
+            <w:pPr>
+              <w:spacing w:before="20" w:after="20"/>
+            </w:pPr>
+            <w:r>
+              <w:t xml:space="preserve">Comunicación asíncrona por el bus de eventos</w:t>
+            </w:r>
+          </w:p>
+        </w:tc>
+      </w:tr>
+      <w:tr>
+        <w:tc>
+          <w:tcPr>
+            <w:tcW w:w="0" w:type="auto"/>
+          </w:tcPr>
+          <w:p>
+            <w:pPr>
+              <w:spacing w:before="20" w:after="20"/>
+            </w:pPr>
+            <w:r>
+              <w:t xml:space="preserve">Nombre precedido de dos puntos</w:t>
+            </w:r>
+          </w:p>
+        </w:tc>
+        <w:tc>
+          <w:tcPr>
+            <w:tcW w:w="0" w:type="auto"/>
+          </w:tcPr>
+          <w:p>
+            <w:pPr>
+              <w:spacing w:before="20" w:after="20"/>
+            </w:pPr>
+            <w:r>
+              <w:t xml:space="preserve">Instancia de componente</w:t>
+            </w:r>
+          </w:p>
+        </w:tc>
+        <w:tc>
+          <w:tcPr>
+            <w:tcW w:w="0" w:type="auto"/>
+          </w:tcPr>
+          <w:p>
+            <w:pPr>
+              <w:spacing w:before="20" w:after="20"/>
+            </w:pPr>
+            <w:r>
+              <w:t xml:space="preserve">Algo que se ejecuta, no un tipo</w:t>
+            </w:r>
+          </w:p>
+        </w:tc>
+      </w:tr>
+    </w:tbl>
+    <w:p>
+      <w:r>
+        <w:t/>
+      </w:r>
+    </w:p>
+    <w:p>
+      <w:r>
+        <w:rPr>
+          <w:b/>
+        </w:rPr>
+        <w:t xml:space="preserve">Por qué esta notación y no cajas genéricas.</w:t>
+      </w:r>
+      <w:r>
+        <w:t xml:space="preserve"> Los puertos y las interfaces son exactamente donde vive el argumento de modificabilidad del ASR-2.1. El componente </w:t>
+      </w:r>
+      <w:r>
+        <w:rPr>
+          <w:rFonts w:ascii="Consolas" w:hAnsi="Consolas"/>
+          <w:sz w:val="18"/>
+          <w:color w:val="B03A2E"/>
+        </w:rPr>
+        <w:t xml:space="preserve">:Pagos</w:t>
+      </w:r>
+      <w:r>
+        <w:t xml:space="preserve"> declara el puerto </w:t>
+      </w:r>
+      <w:r>
+        <w:rPr>
+          <w:rFonts w:ascii="Consolas" w:hAnsi="Consolas"/>
+          <w:sz w:val="18"/>
+          <w:color w:val="B03A2E"/>
+        </w:rPr>
+        <w:t xml:space="preserve">CobrarPrima</w:t>
+      </w:r>
+      <w:r>
+        <w:t xml:space="preserve"> en lenguaje de dominio —autorizar, confirmar, reversar— y no conoce ninguna pasarela concreta; los adaptadores implementan </w:t>
+      </w:r>
+      <w:r>
+        <w:rPr>
+          <w:rFonts w:ascii="Consolas" w:hAnsi="Consolas"/>
+          <w:sz w:val="18"/>
+          <w:color w:val="B03A2E"/>
+        </w:rPr>
+        <w:t xml:space="preserve">PasarelaPago</w:t>
+      </w:r>
+      <w:r>
+        <w:t xml:space="preserve">. Integrar una pasarela nueva no puede obligar a modificar el núcleo porque no existe ninguna arista que salga de él hacia afuera. Con cajas genéricas eso hay que afirmarlo en prosa; en notación UML se lee en el diagrama.</w:t>
+      </w:r>
+    </w:p>
+    <w:p>
+      <w:r>
+        <w:rPr>
+          <w:b/>
+        </w:rPr>
+        <w:t xml:space="preserve">Los ocho contratos del sistema.</w:t>
+      </w:r>
+      <w:r>
+        <w:t xml:space="preserve"> El modelo nombra las interfaces que constituyen la frontera entre componentes: </w:t>
+      </w:r>
+      <w:r>
+        <w:rPr>
+          <w:rFonts w:ascii="Consolas" w:hAnsi="Consolas"/>
+          <w:sz w:val="18"/>
+          <w:color w:val="B03A2E"/>
+        </w:rPr>
+        <w:t xml:space="preserve">APICliente</w:t>
+      </w:r>
+      <w:r>
+        <w:t xml:space="preserve">, </w:t>
+      </w:r>
+      <w:r>
+        <w:rPr>
+          <w:rFonts w:ascii="Consolas" w:hAnsi="Consolas"/>
+          <w:sz w:val="18"/>
+          <w:color w:val="B03A2E"/>
+        </w:rPr>
+        <w:t xml:space="preserve">Cotizar</w:t>
+      </w:r>
+      <w:r>
+        <w:t xml:space="preserve">, </w:t>
+      </w:r>
+      <w:r>
+        <w:rPr>
+          <w:rFonts w:ascii="Consolas" w:hAnsi="Consolas"/>
+          <w:sz w:val="18"/>
+          <w:color w:val="B03A2E"/>
+        </w:rPr>
+        <w:t xml:space="preserve">Scoring</w:t>
+      </w:r>
+      <w:r>
+        <w:t xml:space="preserve">, </w:t>
+      </w:r>
+      <w:r>
+        <w:rPr>
+          <w:rFonts w:ascii="Consolas" w:hAnsi="Consolas"/>
+          <w:sz w:val="18"/>
+          <w:color w:val="B03A2E"/>
+        </w:rPr>
+        <w:t xml:space="preserve">Tokenizar</w:t>
+      </w:r>
+      <w:r>
+        <w:t xml:space="preserve">, </w:t>
+      </w:r>
+      <w:r>
+        <w:rPr>
+          <w:rFonts w:ascii="Consolas" w:hAnsi="Consolas"/>
+          <w:sz w:val="18"/>
+          <w:color w:val="B03A2E"/>
+        </w:rPr>
+        <w:t xml:space="preserve">CobrarPrima</w:t>
+      </w:r>
+      <w:r>
+        <w:t xml:space="preserve">, </w:t>
+      </w:r>
+      <w:r>
+        <w:rPr>
+          <w:rFonts w:ascii="Consolas" w:hAnsi="Consolas"/>
+          <w:sz w:val="18"/>
+          <w:color w:val="B03A2E"/>
+        </w:rPr>
+        <w:t xml:space="preserve">EmitirPoliza</w:t>
+      </w:r>
+      <w:r>
+        <w:t xml:space="preserve">, </w:t>
+      </w:r>
+      <w:r>
+        <w:rPr>
+          <w:rFonts w:ascii="Consolas" w:hAnsi="Consolas"/>
+          <w:sz w:val="18"/>
+          <w:color w:val="B03A2E"/>
+        </w:rPr>
+        <w:t xml:space="preserve">PerfilExterno</w:t>
+      </w:r>
+      <w:r>
+        <w:t xml:space="preserve">, </w:t>
+      </w:r>
+      <w:r>
+        <w:rPr>
+          <w:rFonts w:ascii="Consolas" w:hAnsi="Consolas"/>
+          <w:sz w:val="18"/>
+          <w:color w:val="B03A2E"/>
+        </w:rPr>
+        <w:t xml:space="preserve">PasarelaPago</w:t>
+      </w:r>
+      <w:r>
+        <w:t xml:space="preserve"> y </w:t>
+      </w:r>
+      <w:r>
+        <w:rPr>
+          <w:rFonts w:ascii="Consolas" w:hAnsi="Consolas"/>
+          <w:sz w:val="18"/>
+          <w:color w:val="B03A2E"/>
+        </w:rPr>
+        <w:t xml:space="preserve">VerificarIdentidad</w:t>
+      </w:r>
+      <w:r>
+        <w:t xml:space="preserve">. Esa lista es el contrato que el Proyecto Final 2 debe respetar: los tutores validarán que el código se conforme a esta arquitectura, y estas interfaces son la parte verificable de ese compromiso.</w:t>
+      </w:r>
+    </w:p>
+    <w:p>
+      <w:pPr>
+        <w:pStyle w:val="Heading3"/>
+      </w:pPr>
+      <w:r>
+        <w:t xml:space="preserve">2.4 Vista de despliegue</w:t>
+      </w:r>
+    </w:p>
+    <w:p>
+      <w:r>
+        <w:t xml:space="preserve">La vista de despliegue muestra dónde se ejecuta cada componente y qué mecanismos de redundancia lo protegen.</w:t>
+      </w:r>
+    </w:p>
+    <w:p>
+      <w:pPr>
+        <w:jc w:val="center"/>
+        <w:spacing w:before="160" w:after="60"/>
+      </w:pPr>
+      <w:r>
+        <w:drawing>
+          <wp:inline xmlns:wp="http://schemas.openxmlformats.org/drawingml/2006/wordprocessingDrawing" distT="0" distB="0" distL="0" distR="0">
+            <wp:extent cx="6126480" cy="4015437"/>
+            <wp:docPr id="103" name="Imagen 103"/>
+            <a:graphic xmlns:a="http://schemas.openxmlformats.org/drawingml/2006/main">
+              <a:graphicData uri="http://schemas.openxmlformats.org/drawingml/2006/picture">
+                <pic:pic xmlns:pic="http://schemas.openxmlformats.org/drawingml/2006/picture">
+                  <pic:nvPicPr>
+                    <pic:cNvPr id="103" name="vista_despliegue.png"/>
+                    <pic:cNvPicPr/>
+                  </pic:nvPicPr>
+                  <pic:blipFill>
+                    <a:blip xmlns:r="http://schemas.openxmlformats.org/officeDocument/2006/relationships" r:embed="rIdImg3"/>
                     <a:stretch>
                       <a:fillRect/>
                     </a:stretch>
@@ -2288,7 +2856,7 @@
           <w:sz w:val="18"/>
           <w:color w:val="666666"/>
         </w:rPr>
-        <w:t xml:space="preserve">Figura 3. Vista de despliegue en AWS con redundancia multi-zona y región de recuperación</w:t>
+        <w:t xml:space="preserve">Figura 4. Figura 3. Vista de despliegue en AWS con redundancia multi-zona y región de recuperación</w:t>
       </w:r>
     </w:p>
     <w:p>
@@ -2357,16 +2925,16 @@
         <w:drawing>
           <wp:inline xmlns:wp="http://schemas.openxmlformats.org/drawingml/2006/wordprocessingDrawing" distT="0" distB="0" distL="0" distR="0">
             <wp:extent cx="6126480" cy="2872041"/>
-            <wp:docPr id="103" name="Imagen 103"/>
+            <wp:docPr id="104" name="Imagen 104"/>
             <a:graphic xmlns:a="http://schemas.openxmlformats.org/drawingml/2006/main">
               <a:graphicData uri="http://schemas.openxmlformats.org/drawingml/2006/picture">
                 <pic:pic xmlns:pic="http://schemas.openxmlformats.org/drawingml/2006/picture">
                   <pic:nvPicPr>
-                    <pic:cNvPr id="103" name="vista_informacion.png"/>
+                    <pic:cNvPr id="104" name="vista_informacion.png"/>
                     <pic:cNvPicPr/>
                   </pic:nvPicPr>
                   <pic:blipFill>
-                    <a:blip xmlns:r="http://schemas.openxmlformats.org/officeDocument/2006/relationships" r:embed="rIdImg3"/>
+                    <a:blip xmlns:r="http://schemas.openxmlformats.org/officeDocument/2006/relationships" r:embed="rIdImg4"/>
                     <a:stretch>
                       <a:fillRect/>
                     </a:stretch>
@@ -2398,7 +2966,7 @@
           <w:sz w:val="18"/>
           <w:color w:val="666666"/>
         </w:rPr>
-        <w:t xml:space="preserve">Figura 4. Vista de información: entidades, clasificación de datos y almacenamiento</w:t>
+        <w:t xml:space="preserve">Figura 5. Figura 4. Vista de información: entidades, clasificación de datos y almacenamiento</w:t>
       </w:r>
     </w:p>
     <w:p>
@@ -2648,16 +3216,16 @@
         <w:drawing>
           <wp:inline xmlns:wp="http://schemas.openxmlformats.org/drawingml/2006/wordprocessingDrawing" distT="0" distB="0" distL="0" distR="0">
             <wp:extent cx="6126480" cy="3963646"/>
-            <wp:docPr id="104" name="Imagen 104"/>
+            <wp:docPr id="105" name="Imagen 105"/>
             <a:graphic xmlns:a="http://schemas.openxmlformats.org/drawingml/2006/main">
               <a:graphicData uri="http://schemas.openxmlformats.org/drawingml/2006/picture">
                 <pic:pic xmlns:pic="http://schemas.openxmlformats.org/drawingml/2006/picture">
                   <pic:nvPicPr>
-                    <pic:cNvPr id="104" name="modelo_dominio.png"/>
+                    <pic:cNvPr id="105" name="modelo_dominio.png"/>
                     <pic:cNvPicPr/>
                   </pic:nvPicPr>
                   <pic:blipFill>
-                    <a:blip xmlns:r="http://schemas.openxmlformats.org/officeDocument/2006/relationships" r:embed="rIdImg4"/>
+                    <a:blip xmlns:r="http://schemas.openxmlformats.org/officeDocument/2006/relationships" r:embed="rIdImg5"/>
                     <a:stretch>
                       <a:fillRect/>
                     </a:stretch>
@@ -2689,7 +3257,7 @@
           <w:sz w:val="18"/>
           <w:color w:val="666666"/>
         </w:rPr>
-        <w:t xml:space="preserve">Figura 5. Modelo de dominio: entidades, atributos y cardinalidades</w:t>
+        <w:t xml:space="preserve">Figura 6. Figura 5. Modelo de dominio: entidades, atributos y cardinalidades</w:t>
       </w:r>
     </w:p>
     <w:p>
@@ -3784,16 +4352,16 @@
         <w:drawing>
           <wp:inline xmlns:wp="http://schemas.openxmlformats.org/drawingml/2006/wordprocessingDrawing" distT="0" distB="0" distL="0" distR="0">
             <wp:extent cx="6126480" cy="4508955"/>
-            <wp:docPr id="105" name="Imagen 105"/>
+            <wp:docPr id="106" name="Imagen 106"/>
             <a:graphic xmlns:a="http://schemas.openxmlformats.org/drawingml/2006/main">
               <a:graphicData uri="http://schemas.openxmlformats.org/drawingml/2006/picture">
                 <pic:pic xmlns:pic="http://schemas.openxmlformats.org/drawingml/2006/picture">
                   <pic:nvPicPr>
-                    <pic:cNvPr id="105" name="vista_patrones.png"/>
+                    <pic:cNvPr id="106" name="vista_patrones.png"/>
                     <pic:cNvPicPr/>
                   </pic:nvPicPr>
                   <pic:blipFill>
-                    <a:blip xmlns:r="http://schemas.openxmlformats.org/officeDocument/2006/relationships" r:embed="rIdImg5"/>
+                    <a:blip xmlns:r="http://schemas.openxmlformats.org/officeDocument/2006/relationships" r:embed="rIdImg6"/>
                     <a:stretch>
                       <a:fillRect/>
                     </a:stretch>
@@ -3825,7 +4393,7 @@
           <w:sz w:val="18"/>
           <w:color w:val="666666"/>
         </w:rPr>
-        <w:t xml:space="preserve">Figura 6. Asignación de los doce patrones sobre los componentes de la arquitectura</w:t>
+        <w:t xml:space="preserve">Figura 7. Figura 6. Asignación de los doce patrones sobre los componentes de la arquitectura</w:t>
       </w:r>
     </w:p>
     <w:p>
@@ -4931,16 +5499,16 @@
         <w:drawing>
           <wp:inline xmlns:wp="http://schemas.openxmlformats.org/drawingml/2006/wordprocessingDrawing" distT="0" distB="0" distL="0" distR="0">
             <wp:extent cx="6126480" cy="2577664"/>
-            <wp:docPr id="106" name="Imagen 106"/>
+            <wp:docPr id="107" name="Imagen 107"/>
             <a:graphic xmlns:a="http://schemas.openxmlformats.org/drawingml/2006/main">
               <a:graphicData uri="http://schemas.openxmlformats.org/drawingml/2006/picture">
                 <pic:pic xmlns:pic="http://schemas.openxmlformats.org/drawingml/2006/picture">
                   <pic:nvPicPr>
-                    <pic:cNvPr id="106" name="patron_latencia.png"/>
+                    <pic:cNvPr id="107" name="patron_latencia.png"/>
                     <pic:cNvPicPr/>
                   </pic:nvPicPr>
                   <pic:blipFill>
-                    <a:blip xmlns:r="http://schemas.openxmlformats.org/officeDocument/2006/relationships" r:embed="rIdImg6"/>
+                    <a:blip xmlns:r="http://schemas.openxmlformats.org/officeDocument/2006/relationships" r:embed="rIdImg7"/>
                     <a:stretch>
                       <a:fillRect/>
                     </a:stretch>
@@ -4972,7 +5540,7 @@
           <w:sz w:val="18"/>
           <w:color w:val="666666"/>
         </w:rPr>
-        <w:t xml:space="preserve">Figura 7. Composición de los patrones Cache-Aside, Interruptor de circuito, Timeout y Mamparo en el camino de cotización</w:t>
+        <w:t xml:space="preserve">Figura 8. Figura 7. Composición de los patrones Cache-Aside, Interruptor de circuito, Timeout y Mamparo en el camino de cotización</w:t>
       </w:r>
     </w:p>
     <w:p>
@@ -5006,16 +5574,16 @@
         <w:drawing>
           <wp:inline xmlns:wp="http://schemas.openxmlformats.org/drawingml/2006/wordprocessingDrawing" distT="0" distB="0" distL="0" distR="0">
             <wp:extent cx="6126480" cy="1402220"/>
-            <wp:docPr id="107" name="Imagen 107"/>
+            <wp:docPr id="108" name="Imagen 108"/>
             <a:graphic xmlns:a="http://schemas.openxmlformats.org/drawingml/2006/main">
               <a:graphicData uri="http://schemas.openxmlformats.org/drawingml/2006/picture">
                 <pic:pic xmlns:pic="http://schemas.openxmlformats.org/drawingml/2006/picture">
                   <pic:nvPicPr>
-                    <pic:cNvPr id="107" name="patron_puertos_adaptadores.png"/>
+                    <pic:cNvPr id="108" name="patron_puertos_adaptadores.png"/>
                     <pic:cNvPicPr/>
                   </pic:nvPicPr>
                   <pic:blipFill>
-                    <a:blip xmlns:r="http://schemas.openxmlformats.org/officeDocument/2006/relationships" r:embed="rIdImg7"/>
+                    <a:blip xmlns:r="http://schemas.openxmlformats.org/officeDocument/2006/relationships" r:embed="rIdImg8"/>
                     <a:stretch>
                       <a:fillRect/>
                     </a:stretch>
@@ -5047,7 +5615,7 @@
           <w:sz w:val="18"/>
           <w:color w:val="666666"/>
         </w:rPr>
-        <w:t xml:space="preserve">Figura 8. Puertos, adaptadores y configuración externalizada: ninguna flecha sale del núcleo</w:t>
+        <w:t xml:space="preserve">Figura 9. Figura 8. Puertos, adaptadores y configuración externalizada: ninguna flecha sale del núcleo</w:t>
       </w:r>
     </w:p>
     <w:p>
@@ -5123,16 +5691,16 @@
         <w:drawing>
           <wp:inline xmlns:wp="http://schemas.openxmlformats.org/drawingml/2006/wordprocessingDrawing" distT="0" distB="0" distL="0" distR="0">
             <wp:extent cx="6126480" cy="1403209"/>
-            <wp:docPr id="108" name="Imagen 108"/>
+            <wp:docPr id="109" name="Imagen 109"/>
             <a:graphic xmlns:a="http://schemas.openxmlformats.org/drawingml/2006/main">
               <a:graphicData uri="http://schemas.openxmlformats.org/drawingml/2006/picture">
                 <pic:pic xmlns:pic="http://schemas.openxmlformats.org/drawingml/2006/picture">
                   <pic:nvPicPr>
-                    <pic:cNvPr id="108" name="patron_tokenizacion.png"/>
+                    <pic:cNvPr id="109" name="patron_tokenizacion.png"/>
                     <pic:cNvPicPr/>
                   </pic:nvPicPr>
                   <pic:blipFill>
-                    <a:blip xmlns:r="http://schemas.openxmlformats.org/officeDocument/2006/relationships" r:embed="rIdImg8"/>
+                    <a:blip xmlns:r="http://schemas.openxmlformats.org/officeDocument/2006/relationships" r:embed="rIdImg9"/>
                     <a:stretch>
                       <a:fillRect/>
                     </a:stretch>
@@ -5164,7 +5732,7 @@
           <w:sz w:val="18"/>
           <w:color w:val="666666"/>
         </w:rPr>
-        <w:t xml:space="preserve">Figura 9. Tokenización con custodia única: aguas adentro solo circulan tokens</w:t>
+        <w:t xml:space="preserve">Figura 10. Figura 9. Tokenización con custodia única: aguas adentro solo circulan tokens</w:t>
       </w:r>
     </w:p>
     <w:p>
@@ -21571,20 +22139,20 @@
               <w:spacing w:before="20" w:after="20"/>
             </w:pPr>
             <w:r>
-              <w:t xml:space="preserve">Correcciones de la semana 3, modelos de arquitectura, patrones de diseño, propuesta de experimentos y recorrido por el tablero</w:t>
-            </w:r>
-          </w:p>
-        </w:tc>
-        <w:tc>
-          <w:tcPr>
-            <w:tcW w:w="0" w:type="auto"/>
-          </w:tcPr>
-          <w:p>
-            <w:pPr>
-              <w:spacing w:before="20" w:after="20"/>
-            </w:pPr>
-            <w:r>
-              <w:t xml:space="preserve">8 minutos</w:t>
+              <w:t xml:space="preserve">Corrección de la semana 3, estilo y modelos de arquitectura, patrones, propuesta de experimentos, capacidad del equipo y recorrido por el tablero</w:t>
+            </w:r>
+          </w:p>
+        </w:tc>
+        <w:tc>
+          <w:tcPr>
+            <w:tcW w:w="0" w:type="auto"/>
+          </w:tcPr>
+          <w:p>
+            <w:pPr>
+              <w:spacing w:before="20" w:after="20"/>
+            </w:pPr>
+            <w:r>
+              <w:t xml:space="preserve">10 minutos</w:t>
             </w:r>
           </w:p>
         </w:tc>
@@ -21629,7 +22197,7 @@
         <w:pStyle w:val="Heading3"/>
       </w:pPr>
       <w:r>
-        <w:t xml:space="preserve">8.2 Contenido del video por bloque</w:t>
+        <w:t xml:space="preserve">8.2 Contenido por bloque</w:t>
       </w:r>
     </w:p>
     <w:tbl>
@@ -21741,20 +22309,20 @@
               <w:spacing w:before="20" w:after="20"/>
             </w:pPr>
             <w:r>
-              <w:t xml:space="preserve">Jazmin Córdoba</w:t>
-            </w:r>
-          </w:p>
-        </w:tc>
-        <w:tc>
-          <w:tcPr>
-            <w:tcW w:w="0" w:type="auto"/>
-          </w:tcPr>
-          <w:p>
-            <w:pPr>
-              <w:spacing w:before="20" w:after="20"/>
-            </w:pPr>
-            <w:r>
-              <w:t xml:space="preserve">0:00 – 0:45</w:t>
+              <w:t xml:space="preserve">Jazmin</w:t>
+            </w:r>
+          </w:p>
+        </w:tc>
+        <w:tc>
+          <w:tcPr>
+            <w:tcW w:w="0" w:type="auto"/>
+          </w:tcPr>
+          <w:p>
+            <w:pPr>
+              <w:spacing w:before="20" w:after="20"/>
+            </w:pPr>
+            <w:r>
+              <w:t xml:space="preserve">0:00 – 0:40</w:t>
             </w:r>
           </w:p>
         </w:tc>
@@ -21795,20 +22363,20 @@
               <w:spacing w:before="20" w:after="20"/>
             </w:pPr>
             <w:r>
-              <w:t xml:space="preserve">Jazmin Córdoba</w:t>
-            </w:r>
-          </w:p>
-        </w:tc>
-        <w:tc>
-          <w:tcPr>
-            <w:tcW w:w="0" w:type="auto"/>
-          </w:tcPr>
-          <w:p>
-            <w:pPr>
-              <w:spacing w:before="20" w:after="20"/>
-            </w:pPr>
-            <w:r>
-              <w:t xml:space="preserve">0:45 – 2:15</w:t>
+              <w:t xml:space="preserve">Jazmin</w:t>
+            </w:r>
+          </w:p>
+        </w:tc>
+        <w:tc>
+          <w:tcPr>
+            <w:tcW w:w="0" w:type="auto"/>
+          </w:tcPr>
+          <w:p>
+            <w:pPr>
+              <w:spacing w:before="20" w:after="20"/>
+            </w:pPr>
+            <w:r>
+              <w:t xml:space="preserve">0:40 – 2:10</w:t>
             </w:r>
           </w:p>
         </w:tc>
@@ -21849,33 +22417,33 @@
               <w:spacing w:before="20" w:after="20"/>
             </w:pPr>
             <w:r>
-              <w:t xml:space="preserve">Miguel Gómez</w:t>
-            </w:r>
-          </w:p>
-        </w:tc>
-        <w:tc>
-          <w:tcPr>
-            <w:tcW w:w="0" w:type="auto"/>
-          </w:tcPr>
-          <w:p>
-            <w:pPr>
-              <w:spacing w:before="20" w:after="20"/>
-            </w:pPr>
-            <w:r>
-              <w:t xml:space="preserve">2:15 – 4:00</w:t>
-            </w:r>
-          </w:p>
-        </w:tc>
-        <w:tc>
-          <w:tcPr>
-            <w:tcW w:w="0" w:type="auto"/>
-          </w:tcPr>
-          <w:p>
-            <w:pPr>
-              <w:spacing w:before="20" w:after="20"/>
-            </w:pPr>
-            <w:r>
-              <w:t xml:space="preserve">Los tres modelos de arquitectura</w:t>
+              <w:t xml:space="preserve">Miguel</w:t>
+            </w:r>
+          </w:p>
+        </w:tc>
+        <w:tc>
+          <w:tcPr>
+            <w:tcW w:w="0" w:type="auto"/>
+          </w:tcPr>
+          <w:p>
+            <w:pPr>
+              <w:spacing w:before="20" w:after="20"/>
+            </w:pPr>
+            <w:r>
+              <w:t xml:space="preserve">2:10 – 3:30</w:t>
+            </w:r>
+          </w:p>
+        </w:tc>
+        <w:tc>
+          <w:tcPr>
+            <w:tcW w:w="0" w:type="auto"/>
+          </w:tcPr>
+          <w:p>
+            <w:pPr>
+              <w:spacing w:before="20" w:after="20"/>
+            </w:pPr>
+            <w:r>
+              <w:t xml:space="preserve">Estilo de arquitectura y por qué se eligió</w:t>
             </w:r>
           </w:p>
         </w:tc>
@@ -21903,33 +22471,33 @@
               <w:spacing w:before="20" w:after="20"/>
             </w:pPr>
             <w:r>
-              <w:t xml:space="preserve">Juan Mejía</w:t>
-            </w:r>
-          </w:p>
-        </w:tc>
-        <w:tc>
-          <w:tcPr>
-            <w:tcW w:w="0" w:type="auto"/>
-          </w:tcPr>
-          <w:p>
-            <w:pPr>
-              <w:spacing w:before="20" w:after="20"/>
-            </w:pPr>
-            <w:r>
-              <w:t xml:space="preserve">4:00 – 5:45</w:t>
-            </w:r>
-          </w:p>
-        </w:tc>
-        <w:tc>
-          <w:tcPr>
-            <w:tcW w:w="0" w:type="auto"/>
-          </w:tcPr>
-          <w:p>
-            <w:pPr>
-              <w:spacing w:before="20" w:after="20"/>
-            </w:pPr>
-            <w:r>
-              <w:t xml:space="preserve">Patrones de diseño y su razonamiento frente a los ASR</w:t>
+              <w:t xml:space="preserve">Miguel</w:t>
+            </w:r>
+          </w:p>
+        </w:tc>
+        <w:tc>
+          <w:tcPr>
+            <w:tcW w:w="0" w:type="auto"/>
+          </w:tcPr>
+          <w:p>
+            <w:pPr>
+              <w:spacing w:before="20" w:after="20"/>
+            </w:pPr>
+            <w:r>
+              <w:t xml:space="preserve">3:30 – 5:20</w:t>
+            </w:r>
+          </w:p>
+        </w:tc>
+        <w:tc>
+          <w:tcPr>
+            <w:tcW w:w="0" w:type="auto"/>
+          </w:tcPr>
+          <w:p>
+            <w:pPr>
+              <w:spacing w:before="20" w:after="20"/>
+            </w:pPr>
+            <w:r>
+              <w:t xml:space="preserve">Los seis modelos, con foco en el componente-conector UML</w:t>
             </w:r>
           </w:p>
         </w:tc>
@@ -21957,33 +22525,33 @@
               <w:spacing w:before="20" w:after="20"/>
             </w:pPr>
             <w:r>
-              <w:t xml:space="preserve">Angie Arandio</w:t>
-            </w:r>
-          </w:p>
-        </w:tc>
-        <w:tc>
-          <w:tcPr>
-            <w:tcW w:w="0" w:type="auto"/>
-          </w:tcPr>
-          <w:p>
-            <w:pPr>
-              <w:spacing w:before="20" w:after="20"/>
-            </w:pPr>
-            <w:r>
-              <w:t xml:space="preserve">5:45 – 7:15</w:t>
-            </w:r>
-          </w:p>
-        </w:tc>
-        <w:tc>
-          <w:tcPr>
-            <w:tcW w:w="0" w:type="auto"/>
-          </w:tcPr>
-          <w:p>
-            <w:pPr>
-              <w:spacing w:before="20" w:after="20"/>
-            </w:pPr>
-            <w:r>
-              <w:t xml:space="preserve">Propuesta de experimentos y criterio de selección por incertidumbre</w:t>
+              <w:t xml:space="preserve">Juan</w:t>
+            </w:r>
+          </w:p>
+        </w:tc>
+        <w:tc>
+          <w:tcPr>
+            <w:tcW w:w="0" w:type="auto"/>
+          </w:tcPr>
+          <w:p>
+            <w:pPr>
+              <w:spacing w:before="20" w:after="20"/>
+            </w:pPr>
+            <w:r>
+              <w:t xml:space="preserve">5:20 – 7:00</w:t>
+            </w:r>
+          </w:p>
+        </w:tc>
+        <w:tc>
+          <w:tcPr>
+            <w:tcW w:w="0" w:type="auto"/>
+          </w:tcPr>
+          <w:p>
+            <w:pPr>
+              <w:spacing w:before="20" w:after="20"/>
+            </w:pPr>
+            <w:r>
+              <w:t xml:space="preserve">Patrones, tácticas y trazabilidad con los ASR</w:t>
             </w:r>
           </w:p>
         </w:tc>
@@ -22011,33 +22579,87 @@
               <w:spacing w:before="20" w:after="20"/>
             </w:pPr>
             <w:r>
-              <w:t xml:space="preserve">Jazmin Córdoba</w:t>
-            </w:r>
-          </w:p>
-        </w:tc>
-        <w:tc>
-          <w:tcPr>
-            <w:tcW w:w="0" w:type="auto"/>
-          </w:tcPr>
-          <w:p>
-            <w:pPr>
-              <w:spacing w:before="20" w:after="20"/>
-            </w:pPr>
-            <w:r>
-              <w:t xml:space="preserve">7:15 – 8:00</w:t>
-            </w:r>
-          </w:p>
-        </w:tc>
-        <w:tc>
-          <w:tcPr>
-            <w:tcW w:w="0" w:type="auto"/>
-          </w:tcPr>
-          <w:p>
-            <w:pPr>
-              <w:spacing w:before="20" w:after="20"/>
-            </w:pPr>
-            <w:r>
-              <w:t xml:space="preserve">Tablero actualizado y compromiso por sprint</w:t>
+              <w:t xml:space="preserve">Angie</w:t>
+            </w:r>
+          </w:p>
+        </w:tc>
+        <w:tc>
+          <w:tcPr>
+            <w:tcW w:w="0" w:type="auto"/>
+          </w:tcPr>
+          <w:p>
+            <w:pPr>
+              <w:spacing w:before="20" w:after="20"/>
+            </w:pPr>
+            <w:r>
+              <w:t xml:space="preserve">7:00 – 8:40</w:t>
+            </w:r>
+          </w:p>
+        </w:tc>
+        <w:tc>
+          <w:tcPr>
+            <w:tcW w:w="0" w:type="auto"/>
+          </w:tcPr>
+          <w:p>
+            <w:pPr>
+              <w:spacing w:before="20" w:after="20"/>
+            </w:pPr>
+            <w:r>
+              <w:t xml:space="preserve">Propuesta de experimentos y criterio de cuántos</w:t>
+            </w:r>
+          </w:p>
+        </w:tc>
+      </w:tr>
+      <w:tr>
+        <w:tc>
+          <w:tcPr>
+            <w:tcW w:w="0" w:type="auto"/>
+          </w:tcPr>
+          <w:p>
+            <w:pPr>
+              <w:spacing w:before="20" w:after="20"/>
+            </w:pPr>
+            <w:r>
+              <w:t xml:space="preserve">6</w:t>
+            </w:r>
+          </w:p>
+        </w:tc>
+        <w:tc>
+          <w:tcPr>
+            <w:tcW w:w="0" w:type="auto"/>
+          </w:tcPr>
+          <w:p>
+            <w:pPr>
+              <w:spacing w:before="20" w:after="20"/>
+            </w:pPr>
+            <w:r>
+              <w:t xml:space="preserve">Jazmin</w:t>
+            </w:r>
+          </w:p>
+        </w:tc>
+        <w:tc>
+          <w:tcPr>
+            <w:tcW w:w="0" w:type="auto"/>
+          </w:tcPr>
+          <w:p>
+            <w:pPr>
+              <w:spacing w:before="20" w:after="20"/>
+            </w:pPr>
+            <w:r>
+              <w:t xml:space="preserve">8:40 – 10:00</w:t>
+            </w:r>
+          </w:p>
+        </w:tc>
+        <w:tc>
+          <w:tcPr>
+            <w:tcW w:w="0" w:type="auto"/>
+          </w:tcPr>
+          <w:p>
+            <w:pPr>
+              <w:spacing w:before="20" w:after="20"/>
+            </w:pPr>
+            <w:r>
+              <w:t xml:space="preserve">Capacidad, plan por sprint, tablero y cierre</w:t>
             </w:r>
           </w:p>
         </w:tc>
@@ -22061,7 +22683,493 @@
         <w:pStyle w:val="Quote"/>
       </w:pPr>
       <w:r>
-        <w:t xml:space="preserve">El texto en párrafos es lo que se dice; el texto entre corchetes es lo que se muestra en pantalla. Los tiempos son orientativos.</w:t>
+        <w:t xml:space="preserve">El texto en párrafos es lo que se dice; el texto entre corchetes es lo que se muestra en pantalla. Conviene grabar por bloques y unirlos.</w:t>
+      </w:r>
+    </w:p>
+    <w:p>
+      <w:pPr>
+        <w:pStyle w:val="Heading4"/>
+      </w:pPr>
+      <w:r>
+        <w:t xml:space="preserve">Bloque 0 — Apertura · Jazmin · 0:00 – 0:40</w:t>
+      </w:r>
+    </w:p>
+    <w:p>
+      <w:r>
+        <w:t xml:space="preserve">[Pantalla: portada del entregable]</w:t>
+      </w:r>
+    </w:p>
+    <w:p>
+      <w:r>
+        <w:t xml:space="preserve">Buenas tardes. Somos el Grupo 2 y este es el avance de la semana 4 del proyecto Solventa, nuestra aseguradora digital construida sobre Finanzas Abiertas.</w:t>
+      </w:r>
+    </w:p>
+    <w:p>
+      <w:r>
+        <w:t xml:space="preserve">Esta semana el foco estuvo en la arquitectura, que es lo que el curso pide priorizar en este bloque. Traemos cuatro cosas: la corrección de la entrega de la semana 3, el estilo y los modelos de arquitectura, el diseño detallado con patrones, y la propuesta de experimentos. Empezamos por la corrección, porque cambia la base sobre la que está construido todo lo demás.</w:t>
+      </w:r>
+    </w:p>
+    <w:p>
+      <w:pPr>
+        <w:pStyle w:val="Heading4"/>
+      </w:pPr>
+      <w:r>
+        <w:t xml:space="preserve">Bloque 1 — Corrección de la semana 3 · Jazmin · 0:40 – 2:10</w:t>
+      </w:r>
+    </w:p>
+    <w:p>
+      <w:r>
+        <w:t xml:space="preserve">[Pantalla: sección 9, tabla de correcciones]</w:t>
+      </w:r>
+    </w:p>
+    <w:p>
+      <w:r>
+        <w:t xml:space="preserve">La retroalimentación nos señaló tres cosas y las tomamos todas.</w:t>
+      </w:r>
+    </w:p>
+    <w:p>
+      <w:r>
+        <w:t xml:space="preserve">La primera: se esperaba la lista completa de historias y nosotros entregamos veinte. Al revisar el tablero encontramos el origen exacto del problema, y es más revelador de lo que pensábamos: </w:t>
+      </w:r>
+      <w:r>
+        <w:rPr>
+          <w:b/>
+        </w:rPr>
+        <w:t xml:space="preserve">ocho de esas veinte estaban tipadas en Jira como Función, no como Historia</w:t>
+      </w:r>
+      <w:r>
+        <w:t xml:space="preserve">, y ninguna tenía historias asociadas. O sea que el backlog tenía en realidad doce historias y ocho funciones sin descomponer. El tablero ya nos estaba diciendo lo mismo que el profesor.</w:t>
+      </w:r>
+    </w:p>
+    <w:p>
+      <w:r>
+        <w:t xml:space="preserve">[Pantalla: anexo de mapeo, SOL-3 descompuesta]</w:t>
+      </w:r>
+    </w:p>
+    <w:p>
+      <w:r>
+        <w:t xml:space="preserve">Descompusimos todo. Pasamos de veinte a sesenta y dos historias, y el promedio bajó de siete coma seis a tres coma siete puntos por historia. En el ejercicio encontramos algo que no teníamos: la autenticación web era un recorrido crítico sin una sola historia asociada.</w:t>
+      </w:r>
+    </w:p>
+    <w:p>
+      <w:r>
+        <w:t xml:space="preserve">[Pantalla: sección 7.2, cálculo de capacidad]</w:t>
+      </w:r>
+    </w:p>
+    <w:p>
+      <w:r>
+        <w:t xml:space="preserve">La segunda observación fue que no se encontró la evidencia del cálculo de capacidad. Y tenía razón: el cálculo existía, pero lo habíamos dejado en un archivo del repositorio en vez de ponerlo dentro del documento que se entrega. Esa fue nuestra lección de la semana, y por eso este entregable es un documento único donde todo lo calificable está adentro.</w:t>
+      </w:r>
+    </w:p>
+    <w:p>
+      <w:pPr>
+        <w:pStyle w:val="Heading4"/>
+      </w:pPr>
+      <w:r>
+        <w:t xml:space="preserve">Bloque 2 — Estilo de arquitectura · Miguel · 2:10 – 3:30</w:t>
+      </w:r>
+    </w:p>
+    <w:p>
+      <w:r>
+        <w:t xml:space="preserve">[Pantalla: sección 2.1, tabla de estilos]</w:t>
+      </w:r>
+    </w:p>
+    <w:p>
+      <w:r>
+        <w:t xml:space="preserve">Paso a la arquitectura. Antes de mostrar modelos quiero declarar el estilo, porque es la decisión de la que dependen todas las demás.</w:t>
+      </w:r>
+    </w:p>
+    <w:p>
+      <w:r>
+        <w:t xml:space="preserve">Solventa no adopta un estilo puro sino una combinación de tres. </w:t>
+      </w:r>
+      <w:r>
+        <w:rPr>
+          <w:b/>
+        </w:rPr>
+        <w:t xml:space="preserve">Microservicios</w:t>
+      </w:r>
+      <w:r>
+        <w:t xml:space="preserve"> en el núcleo, </w:t>
+      </w:r>
+      <w:r>
+        <w:rPr>
+          <w:b/>
+        </w:rPr>
+        <w:t xml:space="preserve">capas</w:t>
+      </w:r>
+      <w:r>
+        <w:t xml:space="preserve"> por encima y </w:t>
+      </w:r>
+      <w:r>
+        <w:rPr>
+          <w:b/>
+        </w:rPr>
+        <w:t xml:space="preserve">orientado a eventos</w:t>
+      </w:r>
+      <w:r>
+        <w:t xml:space="preserve"> para lo asíncrono. Cada uno resuelve algo que los otros no.</w:t>
+      </w:r>
+    </w:p>
+    <w:p>
+      <w:r>
+        <w:t xml:space="preserve">Y quiero justificar el primero, porque es el más discutible. Un monolito modular nos habría simplificado estas ocho semanas, y era una alternativa seria. Lo descartamos por una razón concreta: el servicio de Perfilamiento es el único con exigencia de latencia de doscientos milisegundos y el único que enfrenta picos de diez veces el tráfico. En un monolito, escalar ese componente obliga a replicar todo el sistema. La independencia de despliegue no es un fin en sí: es lo que hace económicamente viable el escenario de latencia.</w:t>
+      </w:r>
+    </w:p>
+    <w:p>
+      <w:r>
+        <w:t xml:space="preserve">[Pantalla: último párrafo de 2.1]</w:t>
+      </w:r>
+    </w:p>
+    <w:p>
+      <w:r>
+        <w:t xml:space="preserve">También documentamos lo que dejamos fuera. No adoptamos arquitectura sin servidor pese a que encajaría con los picos, porque los arranques en frío son incompatibles con un presupuesto de doscientos milisegundos. Y no adoptamos malla de servicios porque su costo de operación no se justifica con siete servicios y cuatro personas.</w:t>
+      </w:r>
+    </w:p>
+    <w:p>
+      <w:pPr>
+        <w:pStyle w:val="Heading4"/>
+      </w:pPr>
+      <w:r>
+        <w:t xml:space="preserve">Bloque 3 — Los modelos · Miguel · 3:30 – 5:20</w:t>
+      </w:r>
+    </w:p>
+    <w:p>
+      <w:r>
+        <w:t xml:space="preserve">[Pantalla: Figura 1, contexto]</w:t>
+      </w:r>
+    </w:p>
+    <w:p>
+      <w:r>
+        <w:t xml:space="preserve">Hicimos seis modelos. Este es el de contexto: seis actores y cinco sistemas externos. Lo importante acá es que distinguimos qué integramos de verdad y qué simulamos: Open Finance, pagos y KYC se integran realmente porque son los que traen incertidumbre; Open Data y firma electrónica se simulan.</w:t>
+      </w:r>
+    </w:p>
+    <w:p>
+      <w:r>
+        <w:t xml:space="preserve">[Pantalla: Figura 2, vista funcional]</w:t>
+      </w:r>
+    </w:p>
+    <w:p>
+      <w:r>
+        <w:t xml:space="preserve">Esta es la vista funcional: cuatro capas más la plataforma de datos.</w:t>
+      </w:r>
+    </w:p>
+    <w:p>
+      <w:r>
+        <w:t xml:space="preserve">[Pantalla: Figura 3, componente-conector UML]</w:t>
+      </w:r>
+    </w:p>
+    <w:p>
+      <w:r>
+        <w:t xml:space="preserve">Y esta es la misma estructura en notación UML de componente-conector. Quiero detenerme porque el cambio no es estético.</w:t>
+      </w:r>
+    </w:p>
+    <w:p>
+      <w:r>
+        <w:t xml:space="preserve">En el diagrama anterior una flecha no dice si la interacción es síncrona o asíncrona, ni cuál es el contrato. Acá sí. Los cuadraditos son </w:t>
+      </w:r>
+      <w:r>
+        <w:rPr>
+          <w:b/>
+        </w:rPr>
+        <w:t xml:space="preserve">puertos</w:t>
+      </w:r>
+      <w:r>
+        <w:t xml:space="preserve">, los círculos son </w:t>
+      </w:r>
+      <w:r>
+        <w:rPr>
+          <w:b/>
+        </w:rPr>
+        <w:t xml:space="preserve">interfaces provistas</w:t>
+      </w:r>
+      <w:r>
+        <w:t xml:space="preserve">, los semicírculos son </w:t>
+      </w:r>
+      <w:r>
+        <w:rPr>
+          <w:b/>
+        </w:rPr>
+        <w:t xml:space="preserve">interfaces requeridas</w:t>
+      </w:r>
+      <w:r>
+        <w:t xml:space="preserve">, y donde encajan hay un </w:t>
+      </w:r>
+      <w:r>
+        <w:rPr>
+          <w:b/>
+        </w:rPr>
+        <w:t xml:space="preserve">contrato</w:t>
+      </w:r>
+      <w:r>
+        <w:t xml:space="preserve">.</w:t>
+      </w:r>
+    </w:p>
+    <w:p>
+      <w:r>
+        <w:t xml:space="preserve">Y esto es lo que hace que valga la pena: el componente Pagos declara el puerto </w:t>
+      </w:r>
+      <w:r>
+        <w:rPr>
+          <w:b/>
+        </w:rPr>
+        <w:t xml:space="preserve">CobrarPrima</w:t>
+      </w:r>
+      <w:r>
+        <w:t xml:space="preserve"> en lenguaje de dominio y no conoce ninguna pasarela concreta. Los adaptadores implementan PasarelaPago. Por eso integrar una pasarela nueva no puede obligar a modificar el núcleo: no hay ninguna arista que salga de él hacia afuera. Antes eso teníamos que afirmarlo en prosa; ahora se lee en el diagrama.</w:t>
+      </w:r>
+    </w:p>
+    <w:p>
+      <w:r>
+        <w:t xml:space="preserve">[Pantalla: Figura 4, despliegue]</w:t>
+      </w:r>
+    </w:p>
+    <w:p>
+      <w:r>
+        <w:t xml:space="preserve">El despliegue es activo-activo en dos zonas, no activo-pasivo. La diferencia importa: si una zona cae, la capacidad de la otra ya está caliente, así que la recuperación depende de la detección y no del arranque de instancias.</w:t>
+      </w:r>
+    </w:p>
+    <w:p>
+      <w:r>
+        <w:t xml:space="preserve">[Pantalla: Figuras 5 y 6, información y dominio]</w:t>
+      </w:r>
+    </w:p>
+    <w:p>
+      <w:r>
+        <w:t xml:space="preserve">Y la vista de información, donde clasificamos los datos en tres niveles. Esto es lo que vuelve verificable el escenario de confidencialidad: la afirmación «cero datos personales en texto plano» solo se puede comprobar si antes se declaró qué cuenta como dato personal.</w:t>
+      </w:r>
+    </w:p>
+    <w:p>
+      <w:pPr>
+        <w:pStyle w:val="Heading4"/>
+      </w:pPr>
+      <w:r>
+        <w:t xml:space="preserve">Bloque 4 — Patrones y tácticas · Juan · 5:20 – 7:00</w:t>
+      </w:r>
+    </w:p>
+    <w:p>
+      <w:r>
+        <w:t xml:space="preserve">[Pantalla: sección 3.2, marco]</w:t>
+      </w:r>
+    </w:p>
+    <w:p>
+      <w:r>
+        <w:t xml:space="preserve">Documentamos doce patrones. Antes de mostrarlos quiero aclarar tres conceptos que operan en niveles distintos, porque es fácil confundirlos.</w:t>
+      </w:r>
+    </w:p>
+    <w:p>
+      <w:r>
+        <w:t xml:space="preserve">El </w:t>
+      </w:r>
+      <w:r>
+        <w:rPr>
+          <w:b/>
+        </w:rPr>
+        <w:t xml:space="preserve">atributo de calidad</w:t>
+      </w:r>
+      <w:r>
+        <w:t xml:space="preserve"> es la propiedad que el sistema debe exhibir. La </w:t>
+      </w:r>
+      <w:r>
+        <w:rPr>
+          <w:b/>
+        </w:rPr>
+        <w:t xml:space="preserve">táctica</w:t>
+      </w:r>
+      <w:r>
+        <w:t xml:space="preserve"> es una decisión de diseño elemental que influye sobre esa propiedad. El </w:t>
+      </w:r>
+      <w:r>
+        <w:rPr>
+          <w:b/>
+        </w:rPr>
+        <w:t xml:space="preserve">patrón</w:t>
+      </w:r>
+      <w:r>
+        <w:t xml:space="preserve"> es una composición de tácticas con estructura conocida y contrapartidas documentadas. La cadena que seguimos siempre es la misma: un ASR exige una propiedad, unas tácticas la consiguen, un patrón las materializa, se asigna a componentes, y un experimento mide si funcionó.</w:t>
+      </w:r>
+    </w:p>
+    <w:p>
+      <w:r>
+        <w:t xml:space="preserve">[Pantalla: Figura 7, asignación de patrones]</w:t>
+      </w:r>
+    </w:p>
+    <w:p>
+      <w:r>
+        <w:t xml:space="preserve">Esta vista muestra dónde vive cada patrón. Fíjense que el mamparo y el multi-zona se anotan sobre la capa y no sobre una caja: no son componentes, son políticas transversales.</w:t>
+      </w:r>
+    </w:p>
+    <w:p>
+      <w:r>
+        <w:t xml:space="preserve">[Pantalla: sección 3.4, matriz de trazabilidad]</w:t>
+      </w:r>
+    </w:p>
+    <w:p>
+      <w:r>
+        <w:t xml:space="preserve">Y esta es la matriz completa: patrón, tácticas que materializa, componentes donde vive, ASR que lo justifica y experimento que lo valida. Lo que demuestra es que </w:t>
+      </w:r>
+      <w:r>
+        <w:rPr>
+          <w:b/>
+        </w:rPr>
+        <w:t xml:space="preserve">no hay patrones huérfanos</w:t>
+      </w:r>
+      <w:r>
+        <w:t xml:space="preserve"> —ninguno adoptado sin un requisito que lo exija— ni ASR sin mecanismo asignado.</w:t>
+      </w:r>
+    </w:p>
+    <w:p>
+      <w:r>
+        <w:t xml:space="preserve">[Pantalla: sección 3.6, cache-aside]</w:t>
+      </w:r>
+    </w:p>
+    <w:p>
+      <w:r>
+        <w:t xml:space="preserve">Un ejemplo del razonamiento. El escenario de latencia pide percentil noventa y cinco bajo doscientos milisegundos. El perfil de riesgo requiere consultar Open Finance, que tarda cientos de milisegundos. Ese objetivo es inalcanzable por construcción si la cotización espera esa llamada. Por eso el caché no es una optimización: es lo que hace posible el escenario.</w:t>
+      </w:r>
+    </w:p>
+    <w:p>
+      <w:r>
+        <w:t xml:space="preserve">Y de cada patrón declaramos qué sacrificamos. Acá: un perfil cacheado puede estar hasta quince minutos desactualizado. Para un scoring de seguro es tolerable. No lo sería para un saldo de cuenta, y por eso el caché se aplica al perfil derivado y nunca al dato financiero crudo.</w:t>
+      </w:r>
+    </w:p>
+    <w:p>
+      <w:pPr>
+        <w:pStyle w:val="Heading4"/>
+      </w:pPr>
+      <w:r>
+        <w:t xml:space="preserve">Bloque 5 — Experimentos · Angie · 7:00 – 8:40</w:t>
+      </w:r>
+    </w:p>
+    <w:p>
+      <w:r>
+        <w:t xml:space="preserve">[Pantalla: sección 5.1]</w:t>
+      </w:r>
+    </w:p>
+    <w:p>
+      <w:r>
+        <w:t xml:space="preserve">Diseñamos tres experimentos. Y quiero explicar por qué son tres, porque esa fue la decisión más importante de esta sección.</w:t>
+      </w:r>
+    </w:p>
+    <w:p>
+      <w:r>
+        <w:t xml:space="preserve">Partimos de una distinción: una prueba verifica que el sistema hace lo especificado; un experimento valida una hipótesis de diseño sobre la que tenemos incertidumbre, construyendo una porción real del diseño.</w:t>
+      </w:r>
+    </w:p>
+    <w:p>
+      <w:r>
+        <w:t xml:space="preserve">[Pantalla: sección 5.3, criterio]</w:t>
+      </w:r>
+    </w:p>
+    <w:p>
+      <w:r>
+        <w:t xml:space="preserve">El número sale de dos restricciones. La primera es de calendario: los experimentos se construyen en las semanas seis y siete, que son las mismas dos semanas de toda la experiencia de usuario. Haciendo la cuenta, quedan unas treinta y seis horas para experimentos. Los tres nuestros suman treinta y cuatro.</w:t>
+      </w:r>
+    </w:p>
+    <w:p>
+      <w:r>
+        <w:t xml:space="preserve">La segunda es de utilidad: solo se experimenta donde hay incertidumbre real. Evaluamos los nueve puntos de sensibilidad y solo cuatro resultaron de incertidumbre alta, y de esos uno queda cubierto por otro.</w:t>
+      </w:r>
+    </w:p>
+    <w:p>
+      <w:r>
+        <w:t xml:space="preserve">[Pantalla: sección 5.7, descartados]</w:t>
+      </w:r>
+    </w:p>
+    <w:p>
+      <w:r>
+        <w:t xml:space="preserve">Los cinco que descartamos quedan documentados con su razón. Un caso que ilustra el criterio: la integridad de las pólizas. El bloqueo de escritura del almacenamiento es una garantía de la plataforma, así que ahí no tenemos incertidumbre. La incertidumbre está en si nuestra propia ruta de auditoría detecta el intento en menos de un segundo, y eso es una prueba de configuración, no un experimento.</w:t>
+      </w:r>
+    </w:p>
+    <w:p>
+      <w:r>
+        <w:t xml:space="preserve">[Pantalla: sección 5.5, EXP-02]</w:t>
+      </w:r>
+    </w:p>
+    <w:p>
+      <w:r>
+        <w:t xml:space="preserve">Cada experimento tiene criterio de refutación. Este es el de degradación elegante. Si perdemos peticiones por agotamiento del depósito de conexiones, eso nos diría que los tiempos de espera están mal calibrados frente al presupuesto de latencia. Sabemos de antemano qué aprenderíamos si sale mal, y qué decisión cambiaríamos.</w:t>
+      </w:r>
+    </w:p>
+    <w:p>
+      <w:pPr>
+        <w:pStyle w:val="Heading4"/>
+      </w:pPr>
+      <w:r>
+        <w:t xml:space="preserve">Bloque 6 — Capacidad, plan y tablero · Jazmin · 8:40 – 10:00</w:t>
+      </w:r>
+    </w:p>
+    <w:p>
+      <w:r>
+        <w:t xml:space="preserve">[Pantalla: sección 7.2]</w:t>
+      </w:r>
+    </w:p>
+    <w:p>
+      <w:r>
+        <w:t xml:space="preserve">Cierro con la capacidad, que es lo que nos costó puntos la semana pasada y ahora está completo dentro del entregable.</w:t>
+      </w:r>
+    </w:p>
+    <w:p>
+      <w:r>
+        <w:t xml:space="preserve">Cuatro personas por doce horas son cuarenta y ocho horas semanales. A dos horas por punto son veinticuatro puntos. Con un factor de carga del ochenta por ciento quedan </w:t>
+      </w:r>
+      <w:r>
+        <w:rPr>
+          <w:b/>
+        </w:rPr>
+        <w:t xml:space="preserve">diecinueve puntos por semana</w:t>
+      </w:r>
+      <w:r>
+        <w:t xml:space="preserve">.</w:t>
+      </w:r>
+    </w:p>
+    <w:p>
+      <w:r>
+        <w:t xml:space="preserve">[Pantalla: sección 7.5]</w:t>
+      </w:r>
+    </w:p>
+    <w:p>
+      <w:r>
+        <w:t xml:space="preserve">Y acá está la parte importante. En el Proyecto Final 1 no construimos historias de usuario: construimos arquitectura, experimentos y experiencia de usuario. Las historias se implementan en los tres sprints del Proyecto Final 2, que son siete semanas. Diecinueve por siete son </w:t>
+      </w:r>
+      <w:r>
+        <w:rPr>
+          <w:b/>
+        </w:rPr>
+        <w:t xml:space="preserve">ciento treinta y tres puntos</w:t>
+      </w:r>
+      <w:r>
+        <w:t xml:space="preserve">.</w:t>
+      </w:r>
+    </w:p>
+    <w:p>
+      <w:r>
+        <w:t xml:space="preserve">Nuestro backlog son doscientos veintinueve. No caben. Y lo decimos sin rodeos: forzar los números habría exigido reducir las estimaciones a la mitad, produciendo un plan que se incumple en el primer sprint. Comprometemos treinta historias, ciento treinta y tres puntos, holgura cero. Ante un imprevisto sacamos alcance, no extendemos horas.</w:t>
+      </w:r>
+    </w:p>
+    <w:p>
+      <w:r>
+        <w:t xml:space="preserve">[Pantalla: sección 7.7, viabilidad]</w:t>
+      </w:r>
+    </w:p>
+    <w:p>
+      <w:r>
+        <w:t xml:space="preserve">Verificamos además que la arquitectura sea construible, porque los tutores validarán que el código del Proyecto Final 2 se conforme a ella. Construimos cinco de los siete servicios del núcleo y tres de los cinco adaptadores; el resto se simula o se difiere, y está declarado.</w:t>
+      </w:r>
+    </w:p>
+    <w:p>
+      <w:r>
+        <w:t xml:space="preserve">[Pantalla: tablero de Jira filtrado]</w:t>
+      </w:r>
+    </w:p>
+    <w:p>
+      <w:r>
+        <w:t xml:space="preserve">Y este es el tablero, con las sesenta y dos historias, sus estimaciones y sus etiquetas.</w:t>
+      </w:r>
+    </w:p>
+    <w:p>
+      <w:r>
+        <w:t xml:space="preserve">En la semana cinco cerramos la arquitectura, terminamos el diseño de los experimentos y arrancamos los wireframes. Gracias.</w:t>
       </w:r>
     </w:p>
     <w:p>
@@ -22069,337 +23177,7 @@
         <w:pStyle w:val="Heading3"/>
       </w:pPr>
       <w:r>
-        <w:t xml:space="preserve">Bloque 0 — Apertura · Jazmin · 0:00 – 0:45</w:t>
-      </w:r>
-    </w:p>
-    <w:p>
-      <w:r>
-        <w:t xml:space="preserve">[Pantalla: portada de la hoja de trabajo de la semana 4]</w:t>
-      </w:r>
-    </w:p>
-    <w:p>
-      <w:r>
-        <w:t xml:space="preserve">Buenas tardes. Somos el Grupo 2 y este es el avance de la semana 4 del proyecto Solventa, nuestra aseguradora digital construida sobre Finanzas Abiertas.</w:t>
-      </w:r>
-    </w:p>
-    <w:p>
-      <w:r>
-        <w:t xml:space="preserve">Esta semana tenemos dos cosas para mostrar. La primera es la corrección de la entrega de la semana 3: recibimos una retroalimentación clara sobre el documento de historias de usuario y la trabajamos a fondo. La segunda es el entregable propio de esta semana: los modelos de arquitectura, el diseño detallado con patrones y la propuesta de experimentos.</w:t>
-      </w:r>
-    </w:p>
-    <w:p>
-      <w:r>
-        <w:t xml:space="preserve">Empezamos por la corrección, porque cambia la base sobre la que está construido todo lo demás.</w:t>
-      </w:r>
-    </w:p>
-    <w:p>
-      <w:pPr>
-        <w:pBdr>
-          <w:bottom w:val="single" w:sz="6" w:space="1" w:color="D0D0D0"/>
-        </w:pBdr>
-      </w:pPr>
-    </w:p>
-    <w:p>
-      <w:pPr>
-        <w:pStyle w:val="Heading3"/>
-      </w:pPr>
-      <w:r>
-        <w:t xml:space="preserve">Bloque 1 — Corrección de la semana 3 · Jazmin · 0:45 – 2:15</w:t>
-      </w:r>
-    </w:p>
-    <w:p>
-      <w:r>
-        <w:t xml:space="preserve">[Pantalla: documento de historias de usuario v2.0, sección 1 «Correcciones aplicadas»]</w:t>
-      </w:r>
-    </w:p>
-    <w:p>
-      <w:r>
-        <w:t xml:space="preserve">La retroalimentación nos señaló tres cosas y las tomamos todas.</w:t>
-      </w:r>
-    </w:p>
-    <w:p>
-      <w:r>
-        <w:t xml:space="preserve">La primera: se esperaba la lista completa de historias del proyecto y nosotros entregamos veinte. Al revisarlo entendimos que el problema de fondo no era el número sino la granularidad. Teníamos ciento cincuenta y dos puntos de historia repartidos en veinte historias, es decir un promedio de siete coma seis puntos por historia. Un promedio así significa que lo que llamábamos historias eran en realidad features.</w:t>
-      </w:r>
-    </w:p>
-    <w:p>
-      <w:r>
-        <w:t xml:space="preserve">[Pantalla: anexo de mapeo, mostrando SOL-3 descompuesta en seis historias]</w:t>
-      </w:r>
-    </w:p>
-    <w:p>
-      <w:r>
-        <w:t xml:space="preserve">Por ejemplo, «Cotización de seguros en tiempo real» parecía una historia, pero adentro tenía el consentimiento de Open Finance, la captura de datos, el cálculo de la prima, la comparación de planes y la recuperación de la cotización. Son seis historias distintas, cada una verificable por separado.</w:t>
-      </w:r>
-    </w:p>
-    <w:p>
-      <w:r>
-        <w:t xml:space="preserve">Descompusimos todo el backlog y pasamos de veinte a sesenta y dos historias. El promedio bajó de siete coma seis a tres coma siete puntos por historia, y ninguna historia funcional supera cinco puntos. En el ejercicio encontramos además algo que no teníamos: la autenticación web era un recorrido crítico sin una sola historia asociada. Ahora es una épica propia.</w:t>
-      </w:r>
-    </w:p>
-    <w:p>
-      <w:r>
-        <w:t xml:space="preserve">[Pantalla: sección 2, cálculo de capacidad]</w:t>
-      </w:r>
-    </w:p>
-    <w:p>
-      <w:r>
-        <w:t xml:space="preserve">La segunda observación fue que no se encontró la evidencia del cálculo de capacidad. Y tenía razón: el cálculo existía, pero lo habíamos dejado en un archivo del repositorio en vez de ponerlo dentro del documento que se entrega. Esa fue nuestra lección de la semana. Ahora el cálculo está completo dentro del entregable, paso a paso: cuatro personas por doce horas son cuarenta y ocho horas semanales; a dos horas por punto son veinticuatro puntos; aplicando un factor de carga del ochenta por ciento quedan diecinueve puntos por semana.</w:t>
-      </w:r>
-    </w:p>
-    <w:p>
-      <w:r>
-        <w:t xml:space="preserve">[Pantalla: tabla de capacidad frente al backlog]</w:t>
-      </w:r>
-    </w:p>
-    <w:p>
-      <w:r>
-        <w:t xml:space="preserve">Y la tercera observación, la advertencia sobre el proyecto final dos, la respondimos de frente. Al re-estimar de abajo hacia arriba el backlog subió a doscientos veintinueve puntos. Nuestra capacidad para las semanas cinco a ocho es de setenta y seis. No forzamos las cifras para que cuadraran: declaramos explícitamente qué entra en el Proyecto Final 1 y qué se difiere al 2.</w:t>
-      </w:r>
-    </w:p>
-    <w:p>
-      <w:pPr>
-        <w:pBdr>
-          <w:bottom w:val="single" w:sz="6" w:space="1" w:color="D0D0D0"/>
-        </w:pBdr>
-      </w:pPr>
-    </w:p>
-    <w:p>
-      <w:pPr>
-        <w:pStyle w:val="Heading3"/>
-      </w:pPr>
-      <w:r>
-        <w:t xml:space="preserve">Bloque 2 — Modelos de arquitectura · Miguel · 2:15 – 4:00</w:t>
-      </w:r>
-    </w:p>
-    <w:p>
-      <w:r>
-        <w:t xml:space="preserve">[Pantalla: Figura 1, vista funcional]</w:t>
-      </w:r>
-    </w:p>
-    <w:p>
-      <w:r>
-        <w:t xml:space="preserve">Paso al entregable de esta semana. Definimos tres vistas de la arquitectura.</w:t>
-      </w:r>
-    </w:p>
-    <w:p>
-      <w:r>
-        <w:t xml:space="preserve">Esta es la vista funcional. Son cuatro capas más una plataforma de datos. Arriba los canales: web en Angular, móvil en Kotlin nativo y los sistemas de socios. Después la capa Edge, donde ocurre todo lo que debe pasar antes de tocar lógica de negocio. Luego un backend por canal, y en el centro el núcleo de negocio con siete servicios delimitados por contexto de dominio.</w:t>
-      </w:r>
-    </w:p>
-    <w:p>
-      <w:r>
-        <w:t xml:space="preserve">Lo importante de este diagrama está abajo a la izquierda: los adaptadores externos. Ningún servicio del núcleo conoce el formato de un proveedor. Todo pasa por un adaptador. Esa decisión es la que sostiene el escenario de modificabilidad.</w:t>
-      </w:r>
-    </w:p>
-    <w:p>
-      <w:r>
-        <w:t xml:space="preserve">[Pantalla: Figura 2, vista de despliegue]</w:t>
-      </w:r>
-    </w:p>
-    <w:p>
-      <w:r>
-        <w:t xml:space="preserve">Esta es la vista de despliegue. Dos zonas de disponibilidad en configuración activo-activo, no activo-pasivo. La diferencia importa: si una zona cae, la capacidad de la otra ya está caliente, así que el tiempo de recuperación depende de la detección y no del arranque de instancias. Eso es lo que hace alcanzable el objetivo de diez minutos.</w:t>
-      </w:r>
-    </w:p>
-    <w:p>
-      <w:r>
-        <w:t xml:space="preserve">[Pantalla: Figura 3, vista de información]</w:t>
-      </w:r>
-    </w:p>
-    <w:p>
-      <w:r>
-        <w:t xml:space="preserve">Y esta es la vista de información. Además de las entidades, clasificamos los datos en tres niveles, y el nivel determina el tratamiento. Esto es lo que vuelve verificable el escenario de confidencialidad: la afirmación «cero datos personales en texto plano» solo se puede comprobar si antes se declaró qué cuenta como dato personal.</w:t>
-      </w:r>
-    </w:p>
-    <w:p>
-      <w:pPr>
-        <w:pBdr>
-          <w:bottom w:val="single" w:sz="6" w:space="1" w:color="D0D0D0"/>
-        </w:pBdr>
-      </w:pPr>
-    </w:p>
-    <w:p>
-      <w:pPr>
-        <w:pStyle w:val="Heading3"/>
-      </w:pPr>
-      <w:r>
-        <w:t xml:space="preserve">Bloque 3 — Patrones y su razonamiento · Juan · 4:00 – 5:45</w:t>
-      </w:r>
-    </w:p>
-    <w:p>
-      <w:r>
-        <w:t xml:space="preserve">[Pantalla: sección 3.1, tabla resumen de patrones]</w:t>
-      </w:r>
-    </w:p>
-    <w:p>
-      <w:r>
-        <w:t xml:space="preserve">Documentamos doce patrones. Lo que quiero destacar no es la lista sino cómo la construimos: cada patrón está aquí porque hay un escenario de calidad que lo exige, y de cada uno declaramos qué sacrificamos al adoptarlo.</w:t>
-      </w:r>
-    </w:p>
-    <w:p>
-      <w:r>
-        <w:t xml:space="preserve">[Pantalla: sección 3.2, caché de perfiles]</w:t>
-      </w:r>
-    </w:p>
-    <w:p>
-      <w:r>
-        <w:t xml:space="preserve">Un ejemplo. El escenario de latencia pide percentil noventa y cinco por debajo de doscientos milisegundos. El perfil de riesgo requiere consultar a Open Finance, que tarda cientos de milisegundos. Ese objetivo es inalcanzable por construcción si la cotización espera esa llamada. Por eso el caché de perfiles no es una optimización: es lo que hace posible el escenario.</w:t>
-      </w:r>
-    </w:p>
-    <w:p>
-      <w:r>
-        <w:t xml:space="preserve">Y declaramos la contrapartida: un perfil cacheado puede estar hasta quince minutos desactualizado. Para un scoring de seguro es tolerable. No lo sería para un saldo de cuenta, y por eso el caché se aplica al perfil derivado y nunca al dato financiero crudo.</w:t>
-      </w:r>
-    </w:p>
-    <w:p>
-      <w:r>
-        <w:t xml:space="preserve">[Pantalla: sección 3.6, puertos y adaptadores]</w:t>
-      </w:r>
-    </w:p>
-    <w:p>
-      <w:r>
-        <w:t xml:space="preserve">Otro ejemplo. El escenario de modificabilidad pide integrar una pasarela de pagos nueva en menos de cuatro horas-hombre, sin tocar el núcleo. Con puertos y adaptadores, el núcleo define una interfaz en lenguaje de dominio y no conoce ninguna implementación. Integrar una pasarela nueva es escribir una clase y agregar una línea de configuración. Cero archivos modificados en el núcleo. Y eso no es una promesa: es una propiedad del grafo de dependencias, porque la flecha apunta al revés.</w:t>
-      </w:r>
-    </w:p>
-    <w:p>
-      <w:r>
-        <w:t xml:space="preserve">[Pantalla: sección 4, decisiones descartadas]</w:t>
-      </w:r>
-    </w:p>
-    <w:p>
-      <w:r>
-        <w:t xml:space="preserve">Documentamos también lo que descartamos y por qué. Un monolito modular nos habría simplificado estas ocho semanas, pero impide escalar de forma independiente el servicio de scoring, que es justamente el único con exigencia de latencia y el único con picos de diez veces el tráfico.</w:t>
-      </w:r>
-    </w:p>
-    <w:p>
-      <w:pPr>
-        <w:pBdr>
-          <w:bottom w:val="single" w:sz="6" w:space="1" w:color="D0D0D0"/>
-        </w:pBdr>
-      </w:pPr>
-    </w:p>
-    <w:p>
-      <w:pPr>
-        <w:pStyle w:val="Heading3"/>
-      </w:pPr>
-      <w:r>
-        <w:t xml:space="preserve">Bloque 4 — Propuesta de experimentos · Angie · 5:45 – 7:15</w:t>
-      </w:r>
-    </w:p>
-    <w:p>
-      <w:r>
-        <w:t xml:space="preserve">[Pantalla: sección 5.1, marco de experimentación]</w:t>
-      </w:r>
-    </w:p>
-    <w:p>
-      <w:r>
-        <w:t xml:space="preserve">Diseñamos ocho experimentos que cubren los nueve escenarios de calidad. Partimos de una distinción: una prueba verifica que el sistema hace lo especificado; un experimento verifica que una decisión de diseño produce la propiedad que le atribuimos.</w:t>
-      </w:r>
-    </w:p>
-    <w:p>
-      <w:r>
-        <w:t xml:space="preserve">Por eso cada experimento está formulado como una hipótesis falsable, y cada uno tiene un criterio de refutación explícito. Definimos de antemano qué resultado nos obligaría a cambiar el diseño, porque un experimento que no puede fracasar no aporta información.</w:t>
-      </w:r>
-    </w:p>
-    <w:p>
-      <w:r>
-        <w:t xml:space="preserve">[Pantalla: sección 5.4, EXP-02]</w:t>
-      </w:r>
-    </w:p>
-    <w:p>
-      <w:r>
-        <w:t xml:space="preserve">Este es el de degradación elegante. La hipótesis: con el proveedor respondiendo por encima de setecientos milisegundos y diez veces la carga normal, el interruptor de circuito abre en menos de diez segundos y el sistema mantiene el percentil noventa y cinco bajo doscientos milisegundos sirviendo desde caché, sin perder ninguna petición.</w:t>
-      </w:r>
-    </w:p>
-    <w:p>
-      <w:r>
-        <w:t xml:space="preserve">Y el criterio de refutación: si perdemos peticiones por agotamiento del depósito de conexiones, eso nos diría que los tiempos de espera están mal calibrados frente al presupuesto de latencia. Sabemos de antemano qué aprenderíamos si sale mal.</w:t>
-      </w:r>
-    </w:p>
-    <w:p>
-      <w:r>
-        <w:t xml:space="preserve">[Pantalla: sección 5.13, resumen del programa]</w:t>
-      </w:r>
-    </w:p>
-    <w:p>
-      <w:r>
-        <w:t xml:space="preserve">Calificamos la incertidumbre de cada punto de sensibilidad y eso define cuándo se ejecuta cada uno. Cuatro resultaron de incertidumbre alta y forman el Sprint 1 de diseño, en las semanas cinco y seis. Un ejemplo de cómo esa calificación cambió un experimento: en integridad de pólizas, el bloqueo de escritura del almacenamiento es una garantía de la plataforma, así que ahí no tenemos incertidumbre. La incertidumbre está en si nuestra propia ruta de auditoría detecta el intento en menos de un segundo. Reenfocamos el experimento hacia eso.</w:t>
-      </w:r>
-    </w:p>
-    <w:p>
-      <w:r>
-        <w:t xml:space="preserve">El programa completo son ochenta y dos horas. Cuarenta y dos las comprometemos en el Sprint 1, que es exactamente nuestra capacidad, repartidas entre los cuatro integrantes: once, once, diez y diez horas.</w:t>
-      </w:r>
-    </w:p>
-    <w:p>
-      <w:r>
-        <w:t xml:space="preserve">[Pantalla: sección 6, refinamiento de estrategia de pruebas]</w:t>
-      </w:r>
-    </w:p>
-    <w:p>
-      <w:r>
-        <w:t xml:space="preserve">Refinamos también la estrategia de pruebas. El cambio principal es que incorporamos la prueba de arquitectura como nivel propio, distinto de la prueba de integración, porque su criterio de éxito es una medida y no una aserción.</w:t>
-      </w:r>
-    </w:p>
-    <w:p>
-      <w:pPr>
-        <w:pBdr>
-          <w:bottom w:val="single" w:sz="6" w:space="1" w:color="D0D0D0"/>
-        </w:pBdr>
-      </w:pPr>
-    </w:p>
-    <w:p>
-      <w:pPr>
-        <w:pStyle w:val="Heading3"/>
-      </w:pPr>
-      <w:r>
-        <w:t xml:space="preserve">Bloque 5 — Tablero y cierre · Jazmin · 7:15 – 8:00</w:t>
-      </w:r>
-    </w:p>
-    <w:p>
-      <w:r>
-        <w:t xml:space="preserve">[Pantalla: tablero de Jira con el backlog descompuesto]</w:t>
-      </w:r>
-    </w:p>
-    <w:p>
-      <w:r>
-        <w:t xml:space="preserve">Este es el tablero con el backlog ya descompuesto. Se ven las épicas, la estimación en puntos, la prioridad de cada historia y la asociación de cada historia de arquitectura con su escenario de calidad.</w:t>
-      </w:r>
-    </w:p>
-    <w:p>
-      <w:r>
-        <w:t xml:space="preserve">[Pantalla: sección 7.2, compromiso por sprint]</w:t>
-      </w:r>
-    </w:p>
-    <w:p>
-      <w:r>
-        <w:t xml:space="preserve">Y este es el compromiso por sprint para las cuatro semanas que quedan: dieciocho, dieciocho, diecinueve y veintiún puntos, setenta y seis en total, que es exactamente nuestra capacidad. No dejamos holgura, y lo asumimos de forma explícita: si aparece un imprevisto, sacamos alcance en vez de extender horas.</w:t>
-      </w:r>
-    </w:p>
-    <w:p>
-      <w:r>
-        <w:t xml:space="preserve">En la semana cinco arrancamos con los experimentos de latencia y de degradación elegante, junto con la construcción del núcleo de cotización.</w:t>
-      </w:r>
-    </w:p>
-    <w:p>
-      <w:r>
-        <w:t xml:space="preserve">Gracias.</w:t>
-      </w:r>
-    </w:p>
-    <w:p>
-      <w:pPr>
-        <w:pBdr>
-          <w:bottom w:val="single" w:sz="6" w:space="1" w:color="D0D0D0"/>
-        </w:pBdr>
-      </w:pPr>
-    </w:p>
-    <w:p>
-      <w:pPr>
-        <w:pStyle w:val="Heading3"/>
-      </w:pPr>
-      <w:r>
-        <w:t xml:space="preserve">Lista de verificación antes de grabar</w:t>
+        <w:t xml:space="preserve">8.4 Lista de verificación antes de grabar</w:t>
       </w:r>
     </w:p>
     <w:p>
@@ -22411,7 +23189,7 @@
         </w:numPr>
       </w:pPr>
       <w:r>
-        <w:t xml:space="preserve">[ ] Los tres diagramas se ven nítidos a pantalla completa</w:t>
+        <w:t xml:space="preserve">[ ] Las diez figuras se ven nítidas a pantalla completa</w:t>
       </w:r>
     </w:p>
     <w:p>
@@ -22423,7 +23201,7 @@
         </w:numPr>
       </w:pPr>
       <w:r>
-        <w:t xml:space="preserve">[ ] El tablero de Jira está actualizado con las 62 historias antes de grabar el bloque 5</w:t>
+        <w:t xml:space="preserve">[ ] El tablero de Jira está actualizado antes de grabar el bloque 6</w:t>
       </w:r>
     </w:p>
     <w:p>
@@ -22435,7 +23213,7 @@
         </w:numPr>
       </w:pPr>
       <w:r>
-        <w:t xml:space="preserve">[ ] Los documentos están publicados y sus enlaces funcionan</w:t>
+        <w:t xml:space="preserve">[ ] Cada presentador probó su bloque en voz alta y cabe en su tiempo</w:t>
       </w:r>
     </w:p>
     <w:p>
@@ -22447,7 +23225,7 @@
         </w:numPr>
       </w:pPr>
       <w:r>
-        <w:t xml:space="preserve">[ ] Cada presentador probó su bloque en voz alta y cabe en su tiempo</w:t>
+        <w:t xml:space="preserve">[ ] Audio de un solo canal y volumen parejo entre presentadores</w:t>
       </w:r>
     </w:p>
     <w:p>
@@ -22459,27 +23237,8 @@
         </w:numPr>
       </w:pPr>
       <w:r>
-        <w:t xml:space="preserve">[ ] La grabación tiene audio de un solo canal y volumen parejo entre presentadores</w:t>
-      </w:r>
-    </w:p>
-    <w:p>
-      <w:pPr>
-        <w:pStyle w:val="ListBullet"/>
-        <w:numPr>
-          <w:ilvl w:val="0"/>
-          <w:numId w:val="1"/>
-        </w:numPr>
-      </w:pPr>
-      <w:r>
-        <w:t xml:space="preserve">[ ] El video queda subido con acceso por enlace y ese enlace está pegado en el documento de entregables</w:t>
-      </w:r>
-    </w:p>
-    <w:p>
-      <w:pPr>
-        <w:pBdr>
-          <w:bottom w:val="single" w:sz="6" w:space="1" w:color="D0D0D0"/>
-        </w:pBdr>
-      </w:pPr>
+        <w:t xml:space="preserve">[ ] El video queda subido con acceso por enlace y ese enlace está pegado en §8.1 y §10.1</w:t>
+      </w:r>
     </w:p>
     <w:p>
       <w:pPr>

</xml_diff>

<commit_message>
Reasigna el backlog a los sprints del Proyecto Final 2
Las etiquetas del tablero seguian el encuadre anterior, en el que las
historias se construian en las semanas 5 a 8 del Proyecto Final 1. Con
el marco corregido se construyen en los tres sprints del Proyecto Final
2, y el etiquetado debia reflejarlo.

- proyecto-1 y proyecto-2 se reemplazan por sprint-1, sprint-2, sprint-3
  y diferido en las 62 historias.
- El reparto llena cada sprint hasta su capacidad exacta: 9 historias y
  38 puntos en el primero, 9 y 38 en el segundo, 12 y 57 en el tercero.
  Total comprometido 30 historias y 133 puntos; diferidas 32 con 96.
- Se agrega la etiqueta valvula-escape a las siete historias declaradas
  en la seccion 7.7, para que el mecanismo sea visible en el tablero y
  no solo en el documento.
- La tabla de distribucion por sprint y la guia de etiquetas del
  documento se actualizan para coincidir con el tablero.
</commit_message>
<xml_diff>
--- a/documentos/semana-4/entregable_semana4.docx
+++ b/documentos/semana-4/entregable_semana4.docx
@@ -20101,20 +20101,20 @@
               <w:spacing w:before="20" w:after="20"/>
             </w:pPr>
             <w:r>
-              <w:t xml:space="preserve">Cimientos de arquitectura: persistencia, caché, bus de eventos y tokenización. Autenticación web</w:t>
-            </w:r>
-          </w:p>
-        </w:tc>
-        <w:tc>
-          <w:tcPr>
-            <w:tcW w:w="0" w:type="auto"/>
-          </w:tcPr>
-          <w:p>
-            <w:pPr>
-              <w:spacing w:before="20" w:after="20"/>
-            </w:pPr>
-            <w:r>
-              <w:t xml:space="preserve">8</w:t>
+              <w:t xml:space="preserve">Cimientos de arquitectura: persistencia, caché, bus de eventos, tokenización y consentimientos. Autenticación web completa</w:t>
+            </w:r>
+          </w:p>
+        </w:tc>
+        <w:tc>
+          <w:tcPr>
+            <w:tcW w:w="0" w:type="auto"/>
+          </w:tcPr>
+          <w:p>
+            <w:pPr>
+              <w:spacing w:before="20" w:after="20"/>
+            </w:pPr>
+            <w:r>
+              <w:t xml:space="preserve">9</w:t>
             </w:r>
           </w:p>
         </w:tc>
@@ -20171,20 +20171,20 @@
               <w:spacing w:before="20" w:after="20"/>
             </w:pPr>
             <w:r>
-              <w:t xml:space="preserve">Recorrido de cotización completo con Open Finance. Latencia y degradación elegante</w:t>
-            </w:r>
-          </w:p>
-        </w:tc>
-        <w:tc>
-          <w:tcPr>
-            <w:tcW w:w="0" w:type="auto"/>
-          </w:tcPr>
-          <w:p>
-            <w:pPr>
-              <w:spacing w:before="20" w:after="20"/>
-            </w:pPr>
-            <w:r>
-              <w:t xml:space="preserve">10</w:t>
+              <w:t xml:space="preserve">Recorrido de cotización completo con Open Finance. Latencia del scoring y tolerancia a fallos</w:t>
+            </w:r>
+          </w:p>
+        </w:tc>
+        <w:tc>
+          <w:tcPr>
+            <w:tcW w:w="0" w:type="auto"/>
+          </w:tcPr>
+          <w:p>
+            <w:pPr>
+              <w:spacing w:before="20" w:after="20"/>
+            </w:pPr>
+            <w:r>
+              <w:t xml:space="preserve">9</w:t>
             </w:r>
           </w:p>
         </w:tc>
@@ -20241,7 +20241,7 @@
               <w:spacing w:before="20" w:after="20"/>
             </w:pPr>
             <w:r>
-              <w:t xml:space="preserve">Suscripción, emisión y pagos. Onboarding móvil y billetera. Tolerancia a fallos e integridad</w:t>
+              <w:t xml:space="preserve">Suscripción, emisión y pagos. Onboarding móvil y billetera. Parametrización, pasarelas, integridad y sincronización offline</w:t>
             </w:r>
           </w:p>
         </w:tc>
@@ -20355,6 +20355,55 @@
     <w:p>
       <w:r>
         <w:t/>
+      </w:r>
+    </w:p>
+    <w:p>
+      <w:r>
+        <w:t xml:space="preserve">Cada sprint se llena hasta su capacidad exacta. El detalle historia por historia está en el tablero: filtrando por </w:t>
+      </w:r>
+      <w:r>
+        <w:rPr>
+          <w:rFonts w:ascii="Consolas" w:hAnsi="Consolas"/>
+          <w:sz w:val="18"/>
+          <w:color w:val="B03A2E"/>
+        </w:rPr>
+        <w:t xml:space="preserve">sprint-1</w:t>
+      </w:r>
+      <w:r>
+        <w:t xml:space="preserve">, </w:t>
+      </w:r>
+      <w:r>
+        <w:rPr>
+          <w:rFonts w:ascii="Consolas" w:hAnsi="Consolas"/>
+          <w:sz w:val="18"/>
+          <w:color w:val="B03A2E"/>
+        </w:rPr>
+        <w:t xml:space="preserve">sprint-2</w:t>
+      </w:r>
+      <w:r>
+        <w:t xml:space="preserve"> o </w:t>
+      </w:r>
+      <w:r>
+        <w:rPr>
+          <w:rFonts w:ascii="Consolas" w:hAnsi="Consolas"/>
+          <w:sz w:val="18"/>
+          <w:color w:val="B03A2E"/>
+        </w:rPr>
+        <w:t xml:space="preserve">sprint-3</w:t>
+      </w:r>
+      <w:r>
+        <w:t xml:space="preserve"> se obtiene el contenido de cada uno, y por </w:t>
+      </w:r>
+      <w:r>
+        <w:rPr>
+          <w:rFonts w:ascii="Consolas" w:hAnsi="Consolas"/>
+          <w:sz w:val="18"/>
+          <w:color w:val="B03A2E"/>
+        </w:rPr>
+        <w:t xml:space="preserve">valvula-escape</w:t>
+      </w:r>
+      <w:r>
+        <w:t xml:space="preserve"> las siete historias declaradas en §7.7.</w:t>
       </w:r>
     </w:p>
     <w:p>
@@ -22939,7 +22988,7 @@
                 <w:sz w:val="18"/>
                 <w:color w:val="B03A2E"/>
               </w:rPr>
-              <w:t xml:space="preserve">proyecto-1</w:t>
+              <w:t xml:space="preserve">sprint-1</w:t>
             </w:r>
             <w:r>
               <w:t xml:space="preserve"> · </w:t>
@@ -22950,50 +22999,127 @@
                 <w:sz w:val="18"/>
                 <w:color w:val="B03A2E"/>
               </w:rPr>
-              <w:t xml:space="preserve">proyecto-2</w:t>
-            </w:r>
-          </w:p>
-        </w:tc>
-        <w:tc>
-          <w:tcPr>
-            <w:tcW w:w="0" w:type="auto"/>
-          </w:tcPr>
-          <w:p>
-            <w:pPr>
-              <w:spacing w:before="20" w:after="20"/>
-            </w:pPr>
-            <w:r>
-              <w:t xml:space="preserve">Si entra en el alcance del Proyecto Final 1 o se difiere al 2</w:t>
-            </w:r>
-          </w:p>
-        </w:tc>
-      </w:tr>
-      <w:tr>
-        <w:tc>
-          <w:tcPr>
-            <w:tcW w:w="0" w:type="auto"/>
-          </w:tcPr>
-          <w:p>
-            <w:pPr>
-              <w:spacing w:before="20" w:after="20"/>
-            </w:pPr>
+              <w:t xml:space="preserve">sprint-2</w:t>
+            </w:r>
+            <w:r>
+              <w:t xml:space="preserve"> · </w:t>
+            </w:r>
             <w:r>
               <w:rPr>
                 <w:rFonts w:ascii="Consolas" w:hAnsi="Consolas"/>
                 <w:sz w:val="18"/>
                 <w:color w:val="B03A2E"/>
               </w:rPr>
-              <w:t xml:space="preserve">EXP-01</w:t>
-            </w:r>
-            <w:r>
-              <w:t xml:space="preserve"> … </w:t>
-            </w:r>
+              <w:t xml:space="preserve">sprint-3</w:t>
+            </w:r>
+          </w:p>
+        </w:tc>
+        <w:tc>
+          <w:tcPr>
+            <w:tcW w:w="0" w:type="auto"/>
+          </w:tcPr>
+          <w:p>
+            <w:pPr>
+              <w:spacing w:before="20" w:after="20"/>
+            </w:pPr>
+            <w:r>
+              <w:t xml:space="preserve">Sprint del Proyecto Final 2 en que se construye</w:t>
+            </w:r>
+          </w:p>
+        </w:tc>
+      </w:tr>
+      <w:tr>
+        <w:tc>
+          <w:tcPr>
+            <w:tcW w:w="0" w:type="auto"/>
+          </w:tcPr>
+          <w:p>
+            <w:pPr>
+              <w:spacing w:before="20" w:after="20"/>
+            </w:pPr>
             <w:r>
               <w:rPr>
                 <w:rFonts w:ascii="Consolas" w:hAnsi="Consolas"/>
                 <w:sz w:val="18"/>
                 <w:color w:val="B03A2E"/>
               </w:rPr>
+              <w:t xml:space="preserve">diferido</w:t>
+            </w:r>
+          </w:p>
+        </w:tc>
+        <w:tc>
+          <w:tcPr>
+            <w:tcW w:w="0" w:type="auto"/>
+          </w:tcPr>
+          <w:p>
+            <w:pPr>
+              <w:spacing w:before="20" w:after="20"/>
+            </w:pPr>
+            <w:r>
+              <w:t xml:space="preserve">Fuera del alcance comprometido</w:t>
+            </w:r>
+          </w:p>
+        </w:tc>
+      </w:tr>
+      <w:tr>
+        <w:tc>
+          <w:tcPr>
+            <w:tcW w:w="0" w:type="auto"/>
+          </w:tcPr>
+          <w:p>
+            <w:pPr>
+              <w:spacing w:before="20" w:after="20"/>
+            </w:pPr>
+            <w:r>
+              <w:rPr>
+                <w:rFonts w:ascii="Consolas" w:hAnsi="Consolas"/>
+                <w:sz w:val="18"/>
+                <w:color w:val="B03A2E"/>
+              </w:rPr>
+              <w:t xml:space="preserve">valvula-escape</w:t>
+            </w:r>
+          </w:p>
+        </w:tc>
+        <w:tc>
+          <w:tcPr>
+            <w:tcW w:w="0" w:type="auto"/>
+          </w:tcPr>
+          <w:p>
+            <w:pPr>
+              <w:spacing w:before="20" w:after="20"/>
+            </w:pPr>
+            <w:r>
+              <w:t xml:space="preserve">Historia declarada como primera en salir ante un atraso (§7.7)</w:t>
+            </w:r>
+          </w:p>
+        </w:tc>
+      </w:tr>
+      <w:tr>
+        <w:tc>
+          <w:tcPr>
+            <w:tcW w:w="0" w:type="auto"/>
+          </w:tcPr>
+          <w:p>
+            <w:pPr>
+              <w:spacing w:before="20" w:after="20"/>
+            </w:pPr>
+            <w:r>
+              <w:rPr>
+                <w:rFonts w:ascii="Consolas" w:hAnsi="Consolas"/>
+                <w:sz w:val="18"/>
+                <w:color w:val="B03A2E"/>
+              </w:rPr>
+              <w:t xml:space="preserve">EXP-01</w:t>
+            </w:r>
+            <w:r>
+              <w:t xml:space="preserve"> … </w:t>
+            </w:r>
+            <w:r>
+              <w:rPr>
+                <w:rFonts w:ascii="Consolas" w:hAnsi="Consolas"/>
+                <w:sz w:val="18"/>
+                <w:color w:val="B03A2E"/>
+              </w:rPr>
               <w:t xml:space="preserve">EXP-03</w:t>
             </w:r>
           </w:p>
@@ -23020,7 +23146,7 @@
     </w:p>
     <w:p>
       <w:r>
-        <w:t xml:space="preserve">Para ver únicamente el alcance comprometido de este proyecto, filtrar por </w:t>
+        <w:t xml:space="preserve">Para ver el alcance comprometido, filtrar por </w:t>
       </w:r>
       <w:r>
         <w:rPr>
@@ -23028,10 +23154,43 @@
           <w:sz w:val="18"/>
           <w:color w:val="B03A2E"/>
         </w:rPr>
-        <w:t xml:space="preserve">proyecto-1</w:t>
-      </w:r>
-      <w:r>
-        <w:t xml:space="preserve">: devuelve 17 historias y 76 puntos, que es exactamente el compromiso por sprint de §7.7.</w:t>
+        <w:t xml:space="preserve">sprint-1</w:t>
+      </w:r>
+      <w:r>
+        <w:t xml:space="preserve">, </w:t>
+      </w:r>
+      <w:r>
+        <w:rPr>
+          <w:rFonts w:ascii="Consolas" w:hAnsi="Consolas"/>
+          <w:sz w:val="18"/>
+          <w:color w:val="B03A2E"/>
+        </w:rPr>
+        <w:t xml:space="preserve">sprint-2</w:t>
+      </w:r>
+      <w:r>
+        <w:t xml:space="preserve"> y </w:t>
+      </w:r>
+      <w:r>
+        <w:rPr>
+          <w:rFonts w:ascii="Consolas" w:hAnsi="Consolas"/>
+          <w:sz w:val="18"/>
+          <w:color w:val="B03A2E"/>
+        </w:rPr>
+        <w:t xml:space="preserve">sprint-3</w:t>
+      </w:r>
+      <w:r>
+        <w:t xml:space="preserve">: devuelve 30 historias y 133 puntos, exactamente el compromiso de §7.6. Filtrando por </w:t>
+      </w:r>
+      <w:r>
+        <w:rPr>
+          <w:rFonts w:ascii="Consolas" w:hAnsi="Consolas"/>
+          <w:sz w:val="18"/>
+          <w:color w:val="B03A2E"/>
+        </w:rPr>
+        <w:t xml:space="preserve">diferido</w:t>
+      </w:r>
+      <w:r>
+        <w:t xml:space="preserve"> se obtienen las 32 restantes con sus 96 puntos.</w:t>
       </w:r>
     </w:p>
     <w:p>

</xml_diff>